<commit_message>
grad date + ds resume update
</commit_message>
<xml_diff>
--- a/DS/JashThakkarResume.docx
+++ b/DS/JashThakkarResume.docx
@@ -208,7 +208,29 @@
           <w:sz w:val="16"/>
           <w:szCs w:val="16"/>
         </w:rPr>
-        <w:t>Bachelor of Science in Computer Science | Expected April 2026</w:t>
+        <w:t xml:space="preserve">Bachelor of Science in Computer Science | </w:t>
+      </w:r>
+      <w:r>
+        <w:rPr>
+          <w:rFonts w:ascii="Times New Roman" w:hAnsi="Times New Roman" w:cs="Times New Roman"/>
+          <w:b/>
+          <w:bCs/>
+          <w:color w:val="000000" w:themeColor="text1"/>
+          <w:sz w:val="16"/>
+          <w:szCs w:val="16"/>
+        </w:rPr>
+        <w:t>May</w:t>
+      </w:r>
+      <w:r>
+        <w:rPr>
+          <w:rFonts w:ascii="Times New Roman" w:hAnsi="Times New Roman" w:cs="Times New Roman"/>
+          <w:b/>
+          <w:bCs/>
+          <w:color w:val="000000" w:themeColor="text1"/>
+          <w:sz w:val="16"/>
+          <w:szCs w:val="16"/>
+        </w:rPr>
+        <w:t xml:space="preserve"> 2026</w:t>
       </w:r>
       <w:r>
         <w:rPr>
@@ -297,42 +319,6 @@
       <w:r>
         <w:rPr>
           <w:rFonts w:ascii="Times New Roman" w:hAnsi="Times New Roman" w:cs="Times New Roman"/>
-          <w:color w:val="000000" w:themeColor="text1"/>
-          <w:sz w:val="16"/>
-          <w:szCs w:val="16"/>
-        </w:rPr>
-        <w:br/>
-      </w:r>
-    </w:p>
-    <w:p>
-      <w:pPr>
-        <w:widowControl w:val="0"/>
-        <w:spacing w:after="0" w:line="240" w:lineRule="auto"/>
-        <w:rPr>
-          <w:rFonts w:ascii="Times New Roman" w:hAnsi="Times New Roman" w:cs="Times New Roman"/>
-          <w:b/>
-          <w:bCs/>
-          <w:color w:val="000000" w:themeColor="text1"/>
-          <w:sz w:val="16"/>
-          <w:szCs w:val="16"/>
-        </w:rPr>
-      </w:pPr>
-      <w:r>
-        <w:rPr>
-          <w:rFonts w:ascii="Times New Roman" w:hAnsi="Times New Roman" w:cs="Times New Roman"/>
-          <w:b/>
-          <w:bCs/>
-          <w:color w:val="000000" w:themeColor="text1"/>
-          <w:sz w:val="16"/>
-          <w:szCs w:val="16"/>
-        </w:rPr>
-        <w:t>Certificates of Git Essential Training: The Basics | September 2025</w:t>
-      </w:r>
-      <w:r>
-        <w:rPr>
-          <w:rFonts w:ascii="Times New Roman" w:hAnsi="Times New Roman" w:cs="Times New Roman"/>
-          <w:b/>
-          <w:bCs/>
           <w:color w:val="000000" w:themeColor="text1"/>
           <w:sz w:val="16"/>
           <w:szCs w:val="16"/>
@@ -1558,8 +1544,6 @@
       <w:r>
         <w:rPr>
           <w:rFonts w:ascii="Times New Roman" w:hAnsi="Times New Roman" w:cs="Times New Roman"/>
-          <w:b/>
-          <w:bCs/>
           <w:color w:val="000000" w:themeColor="text1"/>
           <w:sz w:val="16"/>
           <w:szCs w:val="16"/>
@@ -1759,11 +1743,24 @@
           <w:sz w:val="16"/>
           <w:szCs w:val="16"/>
         </w:rPr>
-        <w:t xml:space="preserve">Implemented multiple baseline models including HOG + SVC, </w:t>
-      </w:r>
-      <w:r>
-        <w:rPr>
-          <w:rFonts w:ascii="Times New Roman" w:hAnsi="Times New Roman" w:cs="Times New Roman"/>
+        <w:t xml:space="preserve">Implemented multiple baseline models including </w:t>
+      </w:r>
+      <w:r>
+        <w:rPr>
+          <w:rFonts w:ascii="Times New Roman" w:hAnsi="Times New Roman" w:cs="Times New Roman"/>
+          <w:b/>
+          <w:bCs/>
+          <w:color w:val="000000" w:themeColor="text1"/>
+          <w:sz w:val="16"/>
+          <w:szCs w:val="16"/>
+        </w:rPr>
+        <w:t xml:space="preserve">HOG + SVC, </w:t>
+      </w:r>
+      <w:r>
+        <w:rPr>
+          <w:rFonts w:ascii="Times New Roman" w:hAnsi="Times New Roman" w:cs="Times New Roman"/>
+          <w:b/>
+          <w:bCs/>
           <w:color w:val="000000" w:themeColor="text1"/>
           <w:sz w:val="16"/>
           <w:szCs w:val="16"/>
@@ -1773,11 +1770,22 @@
       <w:r>
         <w:rPr>
           <w:rFonts w:ascii="Times New Roman" w:hAnsi="Times New Roman" w:cs="Times New Roman"/>
-          <w:color w:val="000000" w:themeColor="text1"/>
-          <w:sz w:val="16"/>
-          <w:szCs w:val="16"/>
-        </w:rPr>
-        <w:t xml:space="preserve">NN, and Random Forest models, and through </w:t>
+          <w:b/>
+          <w:bCs/>
+          <w:color w:val="000000" w:themeColor="text1"/>
+          <w:sz w:val="16"/>
+          <w:szCs w:val="16"/>
+        </w:rPr>
+        <w:t xml:space="preserve">NN, and Random Forest </w:t>
+      </w:r>
+      <w:r>
+        <w:rPr>
+          <w:rFonts w:ascii="Times New Roman" w:hAnsi="Times New Roman" w:cs="Times New Roman"/>
+          <w:color w:val="000000" w:themeColor="text1"/>
+          <w:sz w:val="16"/>
+          <w:szCs w:val="16"/>
+        </w:rPr>
+        <w:t xml:space="preserve">models, and through </w:t>
       </w:r>
       <w:r>
         <w:rPr>
@@ -2147,7 +2155,27 @@
           <w:sz w:val="16"/>
           <w:szCs w:val="16"/>
         </w:rPr>
-        <w:t>Designed and built a fully local ML-powered debugging assistant that classifies Python runtime errors using a hybrid rule-based and machine-learning approach to generate structured troubleshooting guidance.</w:t>
+        <w:t xml:space="preserve">Designed and built a fully local ML-powered debugging assistant that classifies </w:t>
+      </w:r>
+      <w:r>
+        <w:rPr>
+          <w:rFonts w:ascii="Times New Roman" w:hAnsi="Times New Roman" w:cs="Times New Roman"/>
+          <w:b/>
+          <w:bCs/>
+          <w:color w:val="000000" w:themeColor="text1"/>
+          <w:sz w:val="16"/>
+          <w:szCs w:val="16"/>
+        </w:rPr>
+        <w:t>Python</w:t>
+      </w:r>
+      <w:r>
+        <w:rPr>
+          <w:rFonts w:ascii="Times New Roman" w:hAnsi="Times New Roman" w:cs="Times New Roman"/>
+          <w:color w:val="000000" w:themeColor="text1"/>
+          <w:sz w:val="16"/>
+          <w:szCs w:val="16"/>
+        </w:rPr>
+        <w:t xml:space="preserve"> runtime errors using a hybrid rule-based and machine-learning approach to generate structured troubleshooting guidance.</w:t>
       </w:r>
     </w:p>
     <w:p>
@@ -2191,7 +2219,47 @@
           <w:sz w:val="16"/>
           <w:szCs w:val="16"/>
         </w:rPr>
-        <w:t>pipeline covering synthetic dataset generation, text preprocessing, TF-IDF feature extraction, and multiclass Logistic Regression training.</w:t>
+        <w:t xml:space="preserve">pipeline covering synthetic dataset generation, text preprocessing, </w:t>
+      </w:r>
+      <w:r>
+        <w:rPr>
+          <w:rFonts w:ascii="Times New Roman" w:hAnsi="Times New Roman" w:cs="Times New Roman"/>
+          <w:b/>
+          <w:bCs/>
+          <w:color w:val="000000" w:themeColor="text1"/>
+          <w:sz w:val="16"/>
+          <w:szCs w:val="16"/>
+        </w:rPr>
+        <w:t>TF-IDF</w:t>
+      </w:r>
+      <w:r>
+        <w:rPr>
+          <w:rFonts w:ascii="Times New Roman" w:hAnsi="Times New Roman" w:cs="Times New Roman"/>
+          <w:color w:val="000000" w:themeColor="text1"/>
+          <w:sz w:val="16"/>
+          <w:szCs w:val="16"/>
+        </w:rPr>
+        <w:t xml:space="preserve"> feature extraction, and multiclass </w:t>
+      </w:r>
+      <w:r>
+        <w:rPr>
+          <w:rFonts w:ascii="Times New Roman" w:hAnsi="Times New Roman" w:cs="Times New Roman"/>
+          <w:b/>
+          <w:bCs/>
+          <w:color w:val="000000" w:themeColor="text1"/>
+          <w:sz w:val="16"/>
+          <w:szCs w:val="16"/>
+        </w:rPr>
+        <w:t>Logistic Regression</w:t>
+      </w:r>
+      <w:r>
+        <w:rPr>
+          <w:rFonts w:ascii="Times New Roman" w:hAnsi="Times New Roman" w:cs="Times New Roman"/>
+          <w:color w:val="000000" w:themeColor="text1"/>
+          <w:sz w:val="16"/>
+          <w:szCs w:val="16"/>
+        </w:rPr>
+        <w:t xml:space="preserve"> training.</w:t>
       </w:r>
     </w:p>
     <w:p>
@@ -2243,7 +2311,27 @@
           <w:sz w:val="16"/>
           <w:szCs w:val="16"/>
         </w:rPr>
-        <w:t>Developed YAML-driven fix playbooks with similarity-based retrieval to deliver actionable debugging checklists and contextual examples, enabling reproducible, offline execution via a CLI.</w:t>
+        <w:t xml:space="preserve">Developed </w:t>
+      </w:r>
+      <w:r>
+        <w:rPr>
+          <w:rFonts w:ascii="Times New Roman" w:hAnsi="Times New Roman" w:cs="Times New Roman"/>
+          <w:b/>
+          <w:bCs/>
+          <w:color w:val="000000" w:themeColor="text1"/>
+          <w:sz w:val="16"/>
+          <w:szCs w:val="16"/>
+        </w:rPr>
+        <w:t>YAML</w:t>
+      </w:r>
+      <w:r>
+        <w:rPr>
+          <w:rFonts w:ascii="Times New Roman" w:hAnsi="Times New Roman" w:cs="Times New Roman"/>
+          <w:color w:val="000000" w:themeColor="text1"/>
+          <w:sz w:val="16"/>
+          <w:szCs w:val="16"/>
+        </w:rPr>
+        <w:t>-driven fix playbooks with similarity-based retrieval to deliver actionable debugging checklists and contextual examples, enabling reproducible, offline execution via a CLI.</w:t>
       </w:r>
     </w:p>
     <w:p>
@@ -2281,7 +2369,7 @@
           <w:szCs w:val="16"/>
           <w:u w:val="single"/>
         </w:rPr>
-        <w:t>Atlas: Social Fitness &amp; Nutrition Platform</w:t>
+        <w:t>A/B Testing Engine</w:t>
       </w:r>
       <w:r>
         <w:rPr>
@@ -2292,7 +2380,18 @@
           <w:sz w:val="16"/>
           <w:szCs w:val="16"/>
         </w:rPr>
-        <w:t xml:space="preserve"> (Flutter, Dart, Firebase, REST APIs, AI APIs) </w:t>
+        <w:t xml:space="preserve"> </w:t>
+      </w:r>
+      <w:r>
+        <w:rPr>
+          <w:rFonts w:ascii="Times New Roman" w:hAnsi="Times New Roman" w:cs="Times New Roman"/>
+          <w:b/>
+          <w:bCs/>
+          <w:color w:val="000000" w:themeColor="text1"/>
+          <w:sz w:val="16"/>
+          <w:szCs w:val="16"/>
+        </w:rPr>
+        <w:t>(Python, Streamlit, scikit-learn, Pandas, NumPy, SciPy, Plotly)</w:t>
       </w:r>
     </w:p>
     <w:p>
@@ -2301,7 +2400,7 @@
         <w:widowControl w:val="0"/>
         <w:numPr>
           <w:ilvl w:val="0"/>
-          <w:numId w:val="39"/>
+          <w:numId w:val="50"/>
         </w:numPr>
         <w:spacing w:after="0" w:line="240" w:lineRule="auto"/>
         <w:rPr>
@@ -2318,34 +2417,16 @@
           <w:sz w:val="16"/>
           <w:szCs w:val="16"/>
         </w:rPr>
-        <w:t>Developed</w:t>
-      </w:r>
-      <w:r>
-        <w:rPr>
-          <w:rFonts w:ascii="Times New Roman" w:hAnsi="Times New Roman" w:cs="Times New Roman"/>
-          <w:color w:val="000000" w:themeColor="text1"/>
-          <w:sz w:val="16"/>
-          <w:szCs w:val="16"/>
-        </w:rPr>
-        <w:t xml:space="preserve"> a large mobile application that combines fitness tracking, nutrition logging, </w:t>
-      </w:r>
-      <w:r>
-        <w:rPr>
-          <w:rFonts w:ascii="Times New Roman" w:hAnsi="Times New Roman" w:cs="Times New Roman"/>
-          <w:color w:val="000000" w:themeColor="text1"/>
-          <w:sz w:val="16"/>
-          <w:szCs w:val="16"/>
-        </w:rPr>
-        <w:t>Artificial Intelligence</w:t>
-      </w:r>
-      <w:r>
-        <w:rPr>
-          <w:rFonts w:ascii="Times New Roman" w:hAnsi="Times New Roman" w:cs="Times New Roman"/>
-          <w:color w:val="000000" w:themeColor="text1"/>
-          <w:sz w:val="16"/>
-          <w:szCs w:val="16"/>
-        </w:rPr>
-        <w:t xml:space="preserve"> driven planning, and social media functionality.</w:t>
+        <w:t xml:space="preserve">Designed </w:t>
+      </w:r>
+      <w:r>
+        <w:rPr>
+          <w:rFonts w:ascii="Times New Roman" w:hAnsi="Times New Roman" w:cs="Times New Roman"/>
+          <w:color w:val="000000" w:themeColor="text1"/>
+          <w:sz w:val="16"/>
+          <w:szCs w:val="16"/>
+        </w:rPr>
+        <w:t>an end-to-end experimentation analytics platform that uses real, and simulated A/B testing data to preform statistical significance testing using two proportion z-tests and t-tests to evaluate features.</w:t>
       </w:r>
     </w:p>
     <w:p>
@@ -2354,7 +2435,7 @@
         <w:widowControl w:val="0"/>
         <w:numPr>
           <w:ilvl w:val="0"/>
-          <w:numId w:val="39"/>
+          <w:numId w:val="50"/>
         </w:numPr>
         <w:spacing w:after="0" w:line="240" w:lineRule="auto"/>
         <w:rPr>
@@ -2371,16 +2452,38 @@
           <w:sz w:val="16"/>
           <w:szCs w:val="16"/>
         </w:rPr>
-        <w:t>Implemented</w:t>
-      </w:r>
-      <w:r>
-        <w:rPr>
-          <w:rFonts w:ascii="Times New Roman" w:hAnsi="Times New Roman" w:cs="Times New Roman"/>
-          <w:color w:val="000000" w:themeColor="text1"/>
-          <w:sz w:val="16"/>
-          <w:szCs w:val="16"/>
-        </w:rPr>
-        <w:t xml:space="preserve"> secure authentication, user profiles, posts, likes, comments, and follower relationships using Firebase Authentication, Firestore, Storage, and security rules.</w:t>
+        <w:t xml:space="preserve">Implemented a hybrid modeling system the combines </w:t>
+      </w:r>
+      <w:r>
+        <w:rPr>
+          <w:rFonts w:ascii="Times New Roman" w:hAnsi="Times New Roman" w:cs="Times New Roman"/>
+          <w:b/>
+          <w:bCs/>
+          <w:color w:val="000000" w:themeColor="text1"/>
+          <w:sz w:val="16"/>
+          <w:szCs w:val="16"/>
+        </w:rPr>
+        <w:t>Logistic Regression and Random Forest</w:t>
+      </w:r>
+      <w:r>
+        <w:rPr>
+          <w:rFonts w:ascii="Times New Roman" w:hAnsi="Times New Roman" w:cs="Times New Roman"/>
+          <w:color w:val="000000" w:themeColor="text1"/>
+          <w:sz w:val="16"/>
+          <w:szCs w:val="16"/>
+        </w:rPr>
+        <w:t xml:space="preserve"> models to predict user conversion probability, compare model performance and generate a prediction using confidence through </w:t>
+      </w:r>
+      <w:r>
+        <w:rPr>
+          <w:rFonts w:ascii="Times New Roman" w:hAnsi="Times New Roman" w:cs="Times New Roman"/>
+          <w:b/>
+          <w:bCs/>
+          <w:color w:val="000000" w:themeColor="text1"/>
+          <w:sz w:val="16"/>
+          <w:szCs w:val="16"/>
+        </w:rPr>
+        <w:t>ROC-AUC.</w:t>
       </w:r>
     </w:p>
     <w:p>
@@ -2389,7 +2492,7 @@
         <w:widowControl w:val="0"/>
         <w:numPr>
           <w:ilvl w:val="0"/>
-          <w:numId w:val="39"/>
+          <w:numId w:val="50"/>
         </w:numPr>
         <w:spacing w:after="0" w:line="240" w:lineRule="auto"/>
         <w:rPr>
@@ -2406,16 +2509,7 @@
           <w:sz w:val="16"/>
           <w:szCs w:val="16"/>
         </w:rPr>
-        <w:t>Integrated</w:t>
-      </w:r>
-      <w:r>
-        <w:rPr>
-          <w:rFonts w:ascii="Times New Roman" w:hAnsi="Times New Roman" w:cs="Times New Roman"/>
-          <w:color w:val="000000" w:themeColor="text1"/>
-          <w:sz w:val="16"/>
-          <w:szCs w:val="16"/>
-        </w:rPr>
-        <w:t xml:space="preserve"> multiple third-party REST APIs to support exercise discovery, workout logging, macro tracking, barcode food lookup, and nutrition data retrieval.</w:t>
+        <w:t>Engineered feature processing pipelines for user behaver data, that included data validation, transformation, and aggregation. Allowing for a robust analysis across both uploaded and generated datasets.</w:t>
       </w:r>
     </w:p>
     <w:p>
@@ -2424,7 +2518,7 @@
         <w:widowControl w:val="0"/>
         <w:numPr>
           <w:ilvl w:val="0"/>
-          <w:numId w:val="39"/>
+          <w:numId w:val="50"/>
         </w:numPr>
         <w:spacing w:after="0" w:line="240" w:lineRule="auto"/>
         <w:rPr>
@@ -2441,34 +2535,7 @@
           <w:sz w:val="16"/>
           <w:szCs w:val="16"/>
         </w:rPr>
-        <w:t>Built</w:t>
-      </w:r>
-      <w:r>
-        <w:rPr>
-          <w:rFonts w:ascii="Times New Roman" w:hAnsi="Times New Roman" w:cs="Times New Roman"/>
-          <w:color w:val="000000" w:themeColor="text1"/>
-          <w:sz w:val="16"/>
-          <w:szCs w:val="16"/>
-        </w:rPr>
-        <w:t xml:space="preserve"> an </w:t>
-      </w:r>
-      <w:r>
-        <w:rPr>
-          <w:rFonts w:ascii="Times New Roman" w:hAnsi="Times New Roman" w:cs="Times New Roman"/>
-          <w:color w:val="000000" w:themeColor="text1"/>
-          <w:sz w:val="16"/>
-          <w:szCs w:val="16"/>
-        </w:rPr>
-        <w:t>Artificial Intelligence</w:t>
-      </w:r>
-      <w:r>
-        <w:rPr>
-          <w:rFonts w:ascii="Times New Roman" w:hAnsi="Times New Roman" w:cs="Times New Roman"/>
-          <w:color w:val="000000" w:themeColor="text1"/>
-          <w:sz w:val="16"/>
-          <w:szCs w:val="16"/>
-        </w:rPr>
-        <w:t xml:space="preserve"> powered assistant using OpenAI API to generate personalized workout and meal plans through structured prompt engineering based on user constraints (equipment, dietary preferences, environment).</w:t>
+        <w:t>Built a decision engine that uses statistical results and ML predictions to produce a rollout recommendation based on significance, lift, and confidence.</w:t>
       </w:r>
     </w:p>
     <w:p>
@@ -2477,7 +2544,7 @@
         <w:widowControl w:val="0"/>
         <w:numPr>
           <w:ilvl w:val="0"/>
-          <w:numId w:val="39"/>
+          <w:numId w:val="50"/>
         </w:numPr>
         <w:spacing w:after="0" w:line="240" w:lineRule="auto"/>
         <w:rPr>
@@ -2494,16 +2561,7 @@
           <w:sz w:val="16"/>
           <w:szCs w:val="16"/>
         </w:rPr>
-        <w:t>Created</w:t>
-      </w:r>
-      <w:r>
-        <w:rPr>
-          <w:rFonts w:ascii="Times New Roman" w:hAnsi="Times New Roman" w:cs="Times New Roman"/>
-          <w:color w:val="000000" w:themeColor="text1"/>
-          <w:sz w:val="16"/>
-          <w:szCs w:val="16"/>
-        </w:rPr>
-        <w:t xml:space="preserve"> modular application pages including Feed, Tracking (Workouts &amp; Nutrition), Artificial Intelligence Assistant, and Profile pages with scalable data models and role-based access control.</w:t>
+        <w:t>Developed a Streamlit dashboard and CLI intercave to visualize experiment results including conversion rates, confidence intervals, and comparisons between models, giving a user-friendly system for data driven decisions.</w:t>
       </w:r>
     </w:p>
     <w:p>
@@ -2898,6 +2956,24 @@
           <w:szCs w:val="16"/>
         </w:rPr>
         <w:t>, Machine Learning Model Development, Data Processing</w:t>
+      </w:r>
+      <w:r>
+        <w:rPr>
+          <w:rFonts w:ascii="Times New Roman" w:hAnsi="Times New Roman" w:cs="Times New Roman"/>
+          <w:color w:val="000000" w:themeColor="text1"/>
+          <w:sz w:val="16"/>
+          <w:szCs w:val="16"/>
+        </w:rPr>
+        <w:t xml:space="preserve">, Data </w:t>
+      </w:r>
+      <w:r>
+        <w:rPr>
+          <w:rFonts w:ascii="Times New Roman" w:hAnsi="Times New Roman" w:cs="Times New Roman"/>
+          <w:color w:val="000000" w:themeColor="text1"/>
+          <w:sz w:val="16"/>
+          <w:szCs w:val="16"/>
+        </w:rPr>
+        <w:t>visualization</w:t>
       </w:r>
     </w:p>
     <w:sectPr>
@@ -5235,6 +5311,120 @@
     </w:lvl>
   </w:abstractNum>
   <w:abstractNum w:abstractNumId="28" w15:restartNumberingAfterBreak="0">
+    <w:nsid w:val="3BFB4352"/>
+    <w:multiLevelType w:val="hybridMultilevel"/>
+    <w:tmpl w:val="C7689BD8"/>
+    <w:lvl w:ilvl="0" w:tplc="3B2EAAA0">
+      <w:start w:val="1"/>
+      <w:numFmt w:val="bullet"/>
+      <w:lvlText w:val=""/>
+      <w:lvlJc w:val="left"/>
+      <w:pPr>
+        <w:ind w:left="720" w:hanging="360"/>
+      </w:pPr>
+      <w:rPr>
+        <w:rFonts w:ascii="Symbol" w:hAnsi="Symbol" w:hint="default"/>
+        <w:u w:val="none"/>
+      </w:rPr>
+    </w:lvl>
+    <w:lvl w:ilvl="1" w:tplc="04090003" w:tentative="1">
+      <w:start w:val="1"/>
+      <w:numFmt w:val="bullet"/>
+      <w:lvlText w:val="o"/>
+      <w:lvlJc w:val="left"/>
+      <w:pPr>
+        <w:ind w:left="1440" w:hanging="360"/>
+      </w:pPr>
+      <w:rPr>
+        <w:rFonts w:ascii="Courier New" w:hAnsi="Courier New" w:cs="Courier New" w:hint="default"/>
+      </w:rPr>
+    </w:lvl>
+    <w:lvl w:ilvl="2" w:tplc="04090005" w:tentative="1">
+      <w:start w:val="1"/>
+      <w:numFmt w:val="bullet"/>
+      <w:lvlText w:val=""/>
+      <w:lvlJc w:val="left"/>
+      <w:pPr>
+        <w:ind w:left="2160" w:hanging="360"/>
+      </w:pPr>
+      <w:rPr>
+        <w:rFonts w:ascii="Wingdings" w:hAnsi="Wingdings" w:hint="default"/>
+      </w:rPr>
+    </w:lvl>
+    <w:lvl w:ilvl="3" w:tplc="04090001" w:tentative="1">
+      <w:start w:val="1"/>
+      <w:numFmt w:val="bullet"/>
+      <w:lvlText w:val=""/>
+      <w:lvlJc w:val="left"/>
+      <w:pPr>
+        <w:ind w:left="2880" w:hanging="360"/>
+      </w:pPr>
+      <w:rPr>
+        <w:rFonts w:ascii="Symbol" w:hAnsi="Symbol" w:hint="default"/>
+      </w:rPr>
+    </w:lvl>
+    <w:lvl w:ilvl="4" w:tplc="04090003" w:tentative="1">
+      <w:start w:val="1"/>
+      <w:numFmt w:val="bullet"/>
+      <w:lvlText w:val="o"/>
+      <w:lvlJc w:val="left"/>
+      <w:pPr>
+        <w:ind w:left="3600" w:hanging="360"/>
+      </w:pPr>
+      <w:rPr>
+        <w:rFonts w:ascii="Courier New" w:hAnsi="Courier New" w:cs="Courier New" w:hint="default"/>
+      </w:rPr>
+    </w:lvl>
+    <w:lvl w:ilvl="5" w:tplc="04090005" w:tentative="1">
+      <w:start w:val="1"/>
+      <w:numFmt w:val="bullet"/>
+      <w:lvlText w:val=""/>
+      <w:lvlJc w:val="left"/>
+      <w:pPr>
+        <w:ind w:left="4320" w:hanging="360"/>
+      </w:pPr>
+      <w:rPr>
+        <w:rFonts w:ascii="Wingdings" w:hAnsi="Wingdings" w:hint="default"/>
+      </w:rPr>
+    </w:lvl>
+    <w:lvl w:ilvl="6" w:tplc="04090001" w:tentative="1">
+      <w:start w:val="1"/>
+      <w:numFmt w:val="bullet"/>
+      <w:lvlText w:val=""/>
+      <w:lvlJc w:val="left"/>
+      <w:pPr>
+        <w:ind w:left="5040" w:hanging="360"/>
+      </w:pPr>
+      <w:rPr>
+        <w:rFonts w:ascii="Symbol" w:hAnsi="Symbol" w:hint="default"/>
+      </w:rPr>
+    </w:lvl>
+    <w:lvl w:ilvl="7" w:tplc="04090003" w:tentative="1">
+      <w:start w:val="1"/>
+      <w:numFmt w:val="bullet"/>
+      <w:lvlText w:val="o"/>
+      <w:lvlJc w:val="left"/>
+      <w:pPr>
+        <w:ind w:left="5760" w:hanging="360"/>
+      </w:pPr>
+      <w:rPr>
+        <w:rFonts w:ascii="Courier New" w:hAnsi="Courier New" w:cs="Courier New" w:hint="default"/>
+      </w:rPr>
+    </w:lvl>
+    <w:lvl w:ilvl="8" w:tplc="04090005" w:tentative="1">
+      <w:start w:val="1"/>
+      <w:numFmt w:val="bullet"/>
+      <w:lvlText w:val=""/>
+      <w:lvlJc w:val="left"/>
+      <w:pPr>
+        <w:ind w:left="6480" w:hanging="360"/>
+      </w:pPr>
+      <w:rPr>
+        <w:rFonts w:ascii="Wingdings" w:hAnsi="Wingdings" w:hint="default"/>
+      </w:rPr>
+    </w:lvl>
+  </w:abstractNum>
+  <w:abstractNum w:abstractNumId="29" w15:restartNumberingAfterBreak="0">
     <w:nsid w:val="3D1B643F"/>
     <w:multiLevelType w:val="hybridMultilevel"/>
     <w:tmpl w:val="75F8482E"/>
@@ -5347,7 +5537,7 @@
       </w:rPr>
     </w:lvl>
   </w:abstractNum>
-  <w:abstractNum w:abstractNumId="29" w15:restartNumberingAfterBreak="0">
+  <w:abstractNum w:abstractNumId="30" w15:restartNumberingAfterBreak="0">
     <w:nsid w:val="3D32586F"/>
     <w:multiLevelType w:val="hybridMultilevel"/>
     <w:tmpl w:val="B7560B88"/>
@@ -5460,7 +5650,7 @@
       </w:rPr>
     </w:lvl>
   </w:abstractNum>
-  <w:abstractNum w:abstractNumId="30" w15:restartNumberingAfterBreak="0">
+  <w:abstractNum w:abstractNumId="31" w15:restartNumberingAfterBreak="0">
     <w:nsid w:val="3DB51BED"/>
     <w:multiLevelType w:val="hybridMultilevel"/>
     <w:tmpl w:val="2EE69D92"/>
@@ -5573,7 +5763,7 @@
       </w:rPr>
     </w:lvl>
   </w:abstractNum>
-  <w:abstractNum w:abstractNumId="31" w15:restartNumberingAfterBreak="0">
+  <w:abstractNum w:abstractNumId="32" w15:restartNumberingAfterBreak="0">
     <w:nsid w:val="41477D68"/>
     <w:multiLevelType w:val="hybridMultilevel"/>
     <w:tmpl w:val="AE1AA672"/>
@@ -5686,7 +5876,7 @@
       </w:rPr>
     </w:lvl>
   </w:abstractNum>
-  <w:abstractNum w:abstractNumId="32" w15:restartNumberingAfterBreak="0">
+  <w:abstractNum w:abstractNumId="33" w15:restartNumberingAfterBreak="0">
     <w:nsid w:val="42377F95"/>
     <w:multiLevelType w:val="hybridMultilevel"/>
     <w:tmpl w:val="B732883A"/>
@@ -5799,7 +5989,7 @@
       </w:rPr>
     </w:lvl>
   </w:abstractNum>
-  <w:abstractNum w:abstractNumId="33" w15:restartNumberingAfterBreak="0">
+  <w:abstractNum w:abstractNumId="34" w15:restartNumberingAfterBreak="0">
     <w:nsid w:val="47112ADE"/>
     <w:multiLevelType w:val="hybridMultilevel"/>
     <w:tmpl w:val="9F40029E"/>
@@ -5912,7 +6102,7 @@
       </w:rPr>
     </w:lvl>
   </w:abstractNum>
-  <w:abstractNum w:abstractNumId="34" w15:restartNumberingAfterBreak="0">
+  <w:abstractNum w:abstractNumId="35" w15:restartNumberingAfterBreak="0">
     <w:nsid w:val="52013DCB"/>
     <w:multiLevelType w:val="hybridMultilevel"/>
     <w:tmpl w:val="8D1AC372"/>
@@ -6024,7 +6214,120 @@
       </w:rPr>
     </w:lvl>
   </w:abstractNum>
-  <w:abstractNum w:abstractNumId="35" w15:restartNumberingAfterBreak="0">
+  <w:abstractNum w:abstractNumId="36" w15:restartNumberingAfterBreak="0">
+    <w:nsid w:val="55706908"/>
+    <w:multiLevelType w:val="hybridMultilevel"/>
+    <w:tmpl w:val="6E88D5C6"/>
+    <w:lvl w:ilvl="0" w:tplc="04090001">
+      <w:start w:val="1"/>
+      <w:numFmt w:val="bullet"/>
+      <w:lvlText w:val=""/>
+      <w:lvlJc w:val="left"/>
+      <w:pPr>
+        <w:ind w:left="720" w:hanging="360"/>
+      </w:pPr>
+      <w:rPr>
+        <w:rFonts w:ascii="Symbol" w:hAnsi="Symbol" w:hint="default"/>
+      </w:rPr>
+    </w:lvl>
+    <w:lvl w:ilvl="1" w:tplc="04090003" w:tentative="1">
+      <w:start w:val="1"/>
+      <w:numFmt w:val="bullet"/>
+      <w:lvlText w:val="o"/>
+      <w:lvlJc w:val="left"/>
+      <w:pPr>
+        <w:ind w:left="1440" w:hanging="360"/>
+      </w:pPr>
+      <w:rPr>
+        <w:rFonts w:ascii="Courier New" w:hAnsi="Courier New" w:cs="Courier New" w:hint="default"/>
+      </w:rPr>
+    </w:lvl>
+    <w:lvl w:ilvl="2" w:tplc="04090005" w:tentative="1">
+      <w:start w:val="1"/>
+      <w:numFmt w:val="bullet"/>
+      <w:lvlText w:val=""/>
+      <w:lvlJc w:val="left"/>
+      <w:pPr>
+        <w:ind w:left="2160" w:hanging="360"/>
+      </w:pPr>
+      <w:rPr>
+        <w:rFonts w:ascii="Wingdings" w:hAnsi="Wingdings" w:hint="default"/>
+      </w:rPr>
+    </w:lvl>
+    <w:lvl w:ilvl="3" w:tplc="04090001" w:tentative="1">
+      <w:start w:val="1"/>
+      <w:numFmt w:val="bullet"/>
+      <w:lvlText w:val=""/>
+      <w:lvlJc w:val="left"/>
+      <w:pPr>
+        <w:ind w:left="2880" w:hanging="360"/>
+      </w:pPr>
+      <w:rPr>
+        <w:rFonts w:ascii="Symbol" w:hAnsi="Symbol" w:hint="default"/>
+      </w:rPr>
+    </w:lvl>
+    <w:lvl w:ilvl="4" w:tplc="04090003" w:tentative="1">
+      <w:start w:val="1"/>
+      <w:numFmt w:val="bullet"/>
+      <w:lvlText w:val="o"/>
+      <w:lvlJc w:val="left"/>
+      <w:pPr>
+        <w:ind w:left="3600" w:hanging="360"/>
+      </w:pPr>
+      <w:rPr>
+        <w:rFonts w:ascii="Courier New" w:hAnsi="Courier New" w:cs="Courier New" w:hint="default"/>
+      </w:rPr>
+    </w:lvl>
+    <w:lvl w:ilvl="5" w:tplc="04090005" w:tentative="1">
+      <w:start w:val="1"/>
+      <w:numFmt w:val="bullet"/>
+      <w:lvlText w:val=""/>
+      <w:lvlJc w:val="left"/>
+      <w:pPr>
+        <w:ind w:left="4320" w:hanging="360"/>
+      </w:pPr>
+      <w:rPr>
+        <w:rFonts w:ascii="Wingdings" w:hAnsi="Wingdings" w:hint="default"/>
+      </w:rPr>
+    </w:lvl>
+    <w:lvl w:ilvl="6" w:tplc="04090001" w:tentative="1">
+      <w:start w:val="1"/>
+      <w:numFmt w:val="bullet"/>
+      <w:lvlText w:val=""/>
+      <w:lvlJc w:val="left"/>
+      <w:pPr>
+        <w:ind w:left="5040" w:hanging="360"/>
+      </w:pPr>
+      <w:rPr>
+        <w:rFonts w:ascii="Symbol" w:hAnsi="Symbol" w:hint="default"/>
+      </w:rPr>
+    </w:lvl>
+    <w:lvl w:ilvl="7" w:tplc="04090003" w:tentative="1">
+      <w:start w:val="1"/>
+      <w:numFmt w:val="bullet"/>
+      <w:lvlText w:val="o"/>
+      <w:lvlJc w:val="left"/>
+      <w:pPr>
+        <w:ind w:left="5760" w:hanging="360"/>
+      </w:pPr>
+      <w:rPr>
+        <w:rFonts w:ascii="Courier New" w:hAnsi="Courier New" w:cs="Courier New" w:hint="default"/>
+      </w:rPr>
+    </w:lvl>
+    <w:lvl w:ilvl="8" w:tplc="04090005" w:tentative="1">
+      <w:start w:val="1"/>
+      <w:numFmt w:val="bullet"/>
+      <w:lvlText w:val=""/>
+      <w:lvlJc w:val="left"/>
+      <w:pPr>
+        <w:ind w:left="6480" w:hanging="360"/>
+      </w:pPr>
+      <w:rPr>
+        <w:rFonts w:ascii="Wingdings" w:hAnsi="Wingdings" w:hint="default"/>
+      </w:rPr>
+    </w:lvl>
+  </w:abstractNum>
+  <w:abstractNum w:abstractNumId="37" w15:restartNumberingAfterBreak="0">
     <w:nsid w:val="576A482B"/>
     <w:multiLevelType w:val="hybridMultilevel"/>
     <w:tmpl w:val="C9CC5464"/>
@@ -6137,7 +6440,7 @@
       </w:rPr>
     </w:lvl>
   </w:abstractNum>
-  <w:abstractNum w:abstractNumId="36" w15:restartNumberingAfterBreak="0">
+  <w:abstractNum w:abstractNumId="38" w15:restartNumberingAfterBreak="0">
     <w:nsid w:val="595A0ED3"/>
     <w:multiLevelType w:val="hybridMultilevel"/>
     <w:tmpl w:val="DF568430"/>
@@ -6250,7 +6553,7 @@
       </w:rPr>
     </w:lvl>
   </w:abstractNum>
-  <w:abstractNum w:abstractNumId="37" w15:restartNumberingAfterBreak="0">
+  <w:abstractNum w:abstractNumId="39" w15:restartNumberingAfterBreak="0">
     <w:nsid w:val="59E73C40"/>
     <w:multiLevelType w:val="hybridMultilevel"/>
     <w:tmpl w:val="55F87B7E"/>
@@ -6363,7 +6666,7 @@
       </w:rPr>
     </w:lvl>
   </w:abstractNum>
-  <w:abstractNum w:abstractNumId="38" w15:restartNumberingAfterBreak="0">
+  <w:abstractNum w:abstractNumId="40" w15:restartNumberingAfterBreak="0">
     <w:nsid w:val="5B593318"/>
     <w:multiLevelType w:val="hybridMultilevel"/>
     <w:tmpl w:val="F5D0CBD0"/>
@@ -6478,7 +6781,7 @@
       </w:rPr>
     </w:lvl>
   </w:abstractNum>
-  <w:abstractNum w:abstractNumId="39" w15:restartNumberingAfterBreak="0">
+  <w:abstractNum w:abstractNumId="41" w15:restartNumberingAfterBreak="0">
     <w:nsid w:val="68EC736B"/>
     <w:multiLevelType w:val="hybridMultilevel"/>
     <w:tmpl w:val="4BDE183A"/>
@@ -6591,7 +6894,7 @@
       </w:rPr>
     </w:lvl>
   </w:abstractNum>
-  <w:abstractNum w:abstractNumId="40" w15:restartNumberingAfterBreak="0">
+  <w:abstractNum w:abstractNumId="42" w15:restartNumberingAfterBreak="0">
     <w:nsid w:val="69205171"/>
     <w:multiLevelType w:val="hybridMultilevel"/>
     <w:tmpl w:val="28EEC00A"/>
@@ -6704,7 +7007,7 @@
       </w:rPr>
     </w:lvl>
   </w:abstractNum>
-  <w:abstractNum w:abstractNumId="41" w15:restartNumberingAfterBreak="0">
+  <w:abstractNum w:abstractNumId="43" w15:restartNumberingAfterBreak="0">
     <w:nsid w:val="750E7AE7"/>
     <w:multiLevelType w:val="hybridMultilevel"/>
     <w:tmpl w:val="6304F4CC"/>
@@ -6817,7 +7120,7 @@
       </w:rPr>
     </w:lvl>
   </w:abstractNum>
-  <w:abstractNum w:abstractNumId="42" w15:restartNumberingAfterBreak="0">
+  <w:abstractNum w:abstractNumId="44" w15:restartNumberingAfterBreak="0">
     <w:nsid w:val="76B1475E"/>
     <w:multiLevelType w:val="hybridMultilevel"/>
     <w:tmpl w:val="344CD90E"/>
@@ -6930,7 +7233,7 @@
       </w:rPr>
     </w:lvl>
   </w:abstractNum>
-  <w:abstractNum w:abstractNumId="43" w15:restartNumberingAfterBreak="0">
+  <w:abstractNum w:abstractNumId="45" w15:restartNumberingAfterBreak="0">
     <w:nsid w:val="779D0A03"/>
     <w:multiLevelType w:val="hybridMultilevel"/>
     <w:tmpl w:val="63ECB6D2"/>
@@ -7045,7 +7348,7 @@
       </w:rPr>
     </w:lvl>
   </w:abstractNum>
-  <w:abstractNum w:abstractNumId="44" w15:restartNumberingAfterBreak="0">
+  <w:abstractNum w:abstractNumId="46" w15:restartNumberingAfterBreak="0">
     <w:nsid w:val="7894229A"/>
     <w:multiLevelType w:val="multilevel"/>
     <w:tmpl w:val="439E9B22"/>
@@ -7194,7 +7497,7 @@
       </w:rPr>
     </w:lvl>
   </w:abstractNum>
-  <w:abstractNum w:abstractNumId="45" w15:restartNumberingAfterBreak="0">
+  <w:abstractNum w:abstractNumId="47" w15:restartNumberingAfterBreak="0">
     <w:nsid w:val="7BCF010E"/>
     <w:multiLevelType w:val="hybridMultilevel"/>
     <w:tmpl w:val="53B8547A"/>
@@ -7307,7 +7610,7 @@
       </w:rPr>
     </w:lvl>
   </w:abstractNum>
-  <w:abstractNum w:abstractNumId="46" w15:restartNumberingAfterBreak="0">
+  <w:abstractNum w:abstractNumId="48" w15:restartNumberingAfterBreak="0">
     <w:nsid w:val="7BD3230C"/>
     <w:multiLevelType w:val="hybridMultilevel"/>
     <w:tmpl w:val="8416D95A"/>
@@ -7422,7 +7725,7 @@
       </w:rPr>
     </w:lvl>
   </w:abstractNum>
-  <w:abstractNum w:abstractNumId="47" w15:restartNumberingAfterBreak="0">
+  <w:abstractNum w:abstractNumId="49" w15:restartNumberingAfterBreak="0">
     <w:nsid w:val="7EA313DC"/>
     <w:multiLevelType w:val="hybridMultilevel"/>
     <w:tmpl w:val="1BC221EE"/>
@@ -7566,31 +7869,31 @@
     <w:abstractNumId w:val="0"/>
   </w:num>
   <w:num w:numId="11" w16cid:durableId="1331257018">
-    <w:abstractNumId w:val="30"/>
+    <w:abstractNumId w:val="31"/>
   </w:num>
   <w:num w:numId="12" w16cid:durableId="1364788414">
     <w:abstractNumId w:val="24"/>
   </w:num>
   <w:num w:numId="13" w16cid:durableId="567155114">
-    <w:abstractNumId w:val="29"/>
+    <w:abstractNumId w:val="30"/>
   </w:num>
   <w:num w:numId="14" w16cid:durableId="1749881709">
-    <w:abstractNumId w:val="44"/>
+    <w:abstractNumId w:val="46"/>
   </w:num>
   <w:num w:numId="15" w16cid:durableId="1423377581">
     <w:abstractNumId w:val="15"/>
   </w:num>
   <w:num w:numId="16" w16cid:durableId="1358970398">
-    <w:abstractNumId w:val="33"/>
+    <w:abstractNumId w:val="34"/>
   </w:num>
   <w:num w:numId="17" w16cid:durableId="1300722175">
     <w:abstractNumId w:val="16"/>
   </w:num>
   <w:num w:numId="18" w16cid:durableId="578487762">
-    <w:abstractNumId w:val="46"/>
+    <w:abstractNumId w:val="48"/>
   </w:num>
   <w:num w:numId="19" w16cid:durableId="1646550044">
-    <w:abstractNumId w:val="38"/>
+    <w:abstractNumId w:val="40"/>
   </w:num>
   <w:num w:numId="20" w16cid:durableId="1319578385">
     <w:abstractNumId w:val="27"/>
@@ -7599,22 +7902,22 @@
     <w:abstractNumId w:val="25"/>
   </w:num>
   <w:num w:numId="22" w16cid:durableId="1309475890">
-    <w:abstractNumId w:val="43"/>
+    <w:abstractNumId w:val="45"/>
   </w:num>
   <w:num w:numId="23" w16cid:durableId="1963268176">
-    <w:abstractNumId w:val="39"/>
+    <w:abstractNumId w:val="41"/>
   </w:num>
   <w:num w:numId="24" w16cid:durableId="450174602">
-    <w:abstractNumId w:val="28"/>
+    <w:abstractNumId w:val="29"/>
   </w:num>
   <w:num w:numId="25" w16cid:durableId="460075657">
     <w:abstractNumId w:val="10"/>
   </w:num>
   <w:num w:numId="26" w16cid:durableId="58334245">
-    <w:abstractNumId w:val="45"/>
+    <w:abstractNumId w:val="47"/>
   </w:num>
   <w:num w:numId="27" w16cid:durableId="1670055102">
-    <w:abstractNumId w:val="34"/>
+    <w:abstractNumId w:val="35"/>
   </w:num>
   <w:num w:numId="28" w16cid:durableId="1124428273">
     <w:abstractNumId w:val="14"/>
@@ -7623,19 +7926,19 @@
     <w:abstractNumId w:val="20"/>
   </w:num>
   <w:num w:numId="30" w16cid:durableId="444806964">
-    <w:abstractNumId w:val="42"/>
+    <w:abstractNumId w:val="44"/>
   </w:num>
   <w:num w:numId="31" w16cid:durableId="2131314946">
     <w:abstractNumId w:val="17"/>
   </w:num>
   <w:num w:numId="32" w16cid:durableId="1440418471">
-    <w:abstractNumId w:val="32"/>
+    <w:abstractNumId w:val="33"/>
   </w:num>
   <w:num w:numId="33" w16cid:durableId="1533037489">
     <w:abstractNumId w:val="19"/>
   </w:num>
   <w:num w:numId="34" w16cid:durableId="70544097">
-    <w:abstractNumId w:val="47"/>
+    <w:abstractNumId w:val="49"/>
   </w:num>
   <w:num w:numId="35" w16cid:durableId="1269698060">
     <w:abstractNumId w:val="21"/>
@@ -7647,13 +7950,13 @@
     <w:abstractNumId w:val="23"/>
   </w:num>
   <w:num w:numId="38" w16cid:durableId="456415175">
-    <w:abstractNumId w:val="31"/>
+    <w:abstractNumId w:val="32"/>
   </w:num>
   <w:num w:numId="39" w16cid:durableId="582449789">
-    <w:abstractNumId w:val="35"/>
+    <w:abstractNumId w:val="37"/>
   </w:num>
   <w:num w:numId="40" w16cid:durableId="822619027">
-    <w:abstractNumId w:val="40"/>
+    <w:abstractNumId w:val="42"/>
   </w:num>
   <w:num w:numId="41" w16cid:durableId="1210730073">
     <w:abstractNumId w:val="13"/>
@@ -7671,13 +7974,19 @@
     <w:abstractNumId w:val="12"/>
   </w:num>
   <w:num w:numId="46" w16cid:durableId="938634799">
-    <w:abstractNumId w:val="37"/>
+    <w:abstractNumId w:val="39"/>
   </w:num>
   <w:num w:numId="47" w16cid:durableId="317539287">
-    <w:abstractNumId w:val="36"/>
+    <w:abstractNumId w:val="38"/>
   </w:num>
   <w:num w:numId="48" w16cid:durableId="1727022387">
-    <w:abstractNumId w:val="41"/>
+    <w:abstractNumId w:val="43"/>
+  </w:num>
+  <w:num w:numId="49" w16cid:durableId="1260017237">
+    <w:abstractNumId w:val="28"/>
+  </w:num>
+  <w:num w:numId="50" w16cid:durableId="2051103251">
+    <w:abstractNumId w:val="36"/>
   </w:num>
 </w:numbering>
 </file>

</xml_diff>

<commit_message>
order change on ds files + link for proj
</commit_message>
<xml_diff>
--- a/DS/JashThakkarResume.docx
+++ b/DS/JashThakkarResume.docx
@@ -1373,7 +1373,11 @@
           <w:szCs w:val="16"/>
         </w:rPr>
       </w:pPr>
-      <w:r>
+    </w:p>
+    <w:p>
+      <w:pPr>
+        <w:widowControl w:val="0"/>
+        <w:spacing w:after="0" w:line="240" w:lineRule="auto"/>
         <w:rPr>
           <w:rFonts w:ascii="Times New Roman" w:hAnsi="Times New Roman" w:cs="Times New Roman"/>
           <w:b/>
@@ -1382,8 +1386,7 @@
           <w:sz w:val="16"/>
           <w:szCs w:val="16"/>
         </w:rPr>
-        <w:br/>
-      </w:r>
+      </w:pPr>
       <w:hyperlink r:id="rId11" w:history="1">
         <w:r>
           <w:rPr>
@@ -1395,7 +1398,7 @@
             <w:sz w:val="16"/>
             <w:szCs w:val="16"/>
           </w:rPr>
-          <w:t>Traffic Sign Image Recognition System</w:t>
+          <w:t>A/B Testing Engine</w:t>
         </w:r>
       </w:hyperlink>
       <w:r>
@@ -1407,75 +1410,7 @@
           <w:sz w:val="16"/>
           <w:szCs w:val="16"/>
         </w:rPr>
-        <w:t xml:space="preserve"> (Python, PyTorch, scikit</w:t>
-      </w:r>
-      <w:r>
-        <w:rPr>
-          <w:rFonts w:ascii="Times New Roman" w:hAnsi="Times New Roman" w:cs="Times New Roman"/>
-          <w:b/>
-          <w:bCs/>
-          <w:color w:val="000000" w:themeColor="text1"/>
-          <w:sz w:val="16"/>
-          <w:szCs w:val="16"/>
-        </w:rPr>
-        <w:t>-l</w:t>
-      </w:r>
-      <w:r>
-        <w:rPr>
-          <w:rFonts w:ascii="Times New Roman" w:hAnsi="Times New Roman" w:cs="Times New Roman"/>
-          <w:b/>
-          <w:bCs/>
-          <w:color w:val="000000" w:themeColor="text1"/>
-          <w:sz w:val="16"/>
-          <w:szCs w:val="16"/>
-        </w:rPr>
-        <w:t>earn, OpenCV</w:t>
-      </w:r>
-      <w:r>
-        <w:rPr>
-          <w:rFonts w:ascii="Times New Roman" w:hAnsi="Times New Roman" w:cs="Times New Roman"/>
-          <w:b/>
-          <w:bCs/>
-          <w:color w:val="000000" w:themeColor="text1"/>
-          <w:sz w:val="16"/>
-          <w:szCs w:val="16"/>
-        </w:rPr>
-        <w:t xml:space="preserve">, Pandas, NumPy, </w:t>
-      </w:r>
-      <w:proofErr w:type="spellStart"/>
-      <w:r>
-        <w:rPr>
-          <w:rFonts w:ascii="Times New Roman" w:hAnsi="Times New Roman" w:cs="Times New Roman"/>
-          <w:b/>
-          <w:bCs/>
-          <w:color w:val="000000" w:themeColor="text1"/>
-          <w:sz w:val="16"/>
-          <w:szCs w:val="16"/>
-        </w:rPr>
-        <w:t>Torchvision</w:t>
-      </w:r>
-      <w:proofErr w:type="spellEnd"/>
-      <w:r>
-        <w:rPr>
-          <w:rFonts w:ascii="Times New Roman" w:hAnsi="Times New Roman" w:cs="Times New Roman"/>
-          <w:b/>
-          <w:bCs/>
-          <w:color w:val="000000" w:themeColor="text1"/>
-          <w:sz w:val="16"/>
-          <w:szCs w:val="16"/>
-        </w:rPr>
-        <w:t>, Matplotlib</w:t>
-      </w:r>
-      <w:r>
-        <w:rPr>
-          <w:rFonts w:ascii="Times New Roman" w:hAnsi="Times New Roman" w:cs="Times New Roman"/>
-          <w:b/>
-          <w:bCs/>
-          <w:color w:val="000000" w:themeColor="text1"/>
-          <w:sz w:val="16"/>
-          <w:szCs w:val="16"/>
-        </w:rPr>
-        <w:t xml:space="preserve">) </w:t>
+        <w:t xml:space="preserve"> (Python, Streamlit, scikit-learn, Pandas, NumPy, SciPy, Plotly)</w:t>
       </w:r>
     </w:p>
     <w:p>
@@ -1484,7 +1419,7 @@
         <w:widowControl w:val="0"/>
         <w:numPr>
           <w:ilvl w:val="0"/>
-          <w:numId w:val="40"/>
+          <w:numId w:val="50"/>
         </w:numPr>
         <w:spacing w:after="0" w:line="240" w:lineRule="auto"/>
         <w:rPr>
@@ -1501,72 +1436,7 @@
           <w:sz w:val="16"/>
           <w:szCs w:val="16"/>
         </w:rPr>
-        <w:t xml:space="preserve">Built an image recognition and classification </w:t>
-      </w:r>
-      <w:r>
-        <w:rPr>
-          <w:rFonts w:ascii="Times New Roman" w:hAnsi="Times New Roman" w:cs="Times New Roman"/>
-          <w:color w:val="000000" w:themeColor="text1"/>
-          <w:sz w:val="16"/>
-          <w:szCs w:val="16"/>
-        </w:rPr>
-        <w:t>models</w:t>
-      </w:r>
-      <w:r>
-        <w:rPr>
-          <w:rFonts w:ascii="Times New Roman" w:hAnsi="Times New Roman" w:cs="Times New Roman"/>
-          <w:color w:val="000000" w:themeColor="text1"/>
-          <w:sz w:val="16"/>
-          <w:szCs w:val="16"/>
-        </w:rPr>
-        <w:t xml:space="preserve"> for </w:t>
-      </w:r>
-      <w:r>
-        <w:rPr>
-          <w:rFonts w:ascii="Times New Roman" w:hAnsi="Times New Roman" w:cs="Times New Roman"/>
-          <w:b/>
-          <w:bCs/>
-          <w:color w:val="000000" w:themeColor="text1"/>
-          <w:sz w:val="16"/>
-          <w:szCs w:val="16"/>
-        </w:rPr>
-        <w:t>43</w:t>
-      </w:r>
-      <w:r>
-        <w:rPr>
-          <w:rFonts w:ascii="Times New Roman" w:hAnsi="Times New Roman" w:cs="Times New Roman"/>
-          <w:color w:val="000000" w:themeColor="text1"/>
-          <w:sz w:val="16"/>
-          <w:szCs w:val="16"/>
-        </w:rPr>
-        <w:t xml:space="preserve"> traffic sign classes using the </w:t>
-      </w:r>
-      <w:r>
-        <w:rPr>
-          <w:rFonts w:ascii="Times New Roman" w:hAnsi="Times New Roman" w:cs="Times New Roman"/>
-          <w:color w:val="000000" w:themeColor="text1"/>
-          <w:sz w:val="16"/>
-          <w:szCs w:val="16"/>
-        </w:rPr>
-        <w:t>GTSRB</w:t>
-      </w:r>
-      <w:r>
-        <w:rPr>
-          <w:rFonts w:ascii="Times New Roman" w:hAnsi="Times New Roman" w:cs="Times New Roman"/>
-          <w:color w:val="000000" w:themeColor="text1"/>
-          <w:sz w:val="16"/>
-          <w:szCs w:val="16"/>
-        </w:rPr>
-        <w:t xml:space="preserve"> dataset, training, evaluating, and optimizing multiple machine learning models</w:t>
-      </w:r>
-      <w:r>
-        <w:rPr>
-          <w:rFonts w:ascii="Times New Roman" w:hAnsi="Times New Roman" w:cs="Times New Roman"/>
-          <w:color w:val="000000" w:themeColor="text1"/>
-          <w:sz w:val="16"/>
-          <w:szCs w:val="16"/>
-        </w:rPr>
-        <w:t>.</w:t>
+        <w:t>Designed an end-to-end experimentation analytics platform that uses real, and simulated A/B testing data to preform statistical significance testing using two proportion z-tests and t-tests to evaluate features.</w:t>
       </w:r>
     </w:p>
     <w:p>
@@ -1575,7 +1445,7 @@
         <w:widowControl w:val="0"/>
         <w:numPr>
           <w:ilvl w:val="0"/>
-          <w:numId w:val="40"/>
+          <w:numId w:val="50"/>
         </w:numPr>
         <w:spacing w:after="0" w:line="240" w:lineRule="auto"/>
         <w:rPr>
@@ -1592,7 +1462,7 @@
           <w:sz w:val="16"/>
           <w:szCs w:val="16"/>
         </w:rPr>
-        <w:t xml:space="preserve">Developed a </w:t>
+        <w:t xml:space="preserve">Implemented a hybrid modeling system the combines </w:t>
       </w:r>
       <w:r>
         <w:rPr>
@@ -1603,25 +1473,16 @@
           <w:sz w:val="16"/>
           <w:szCs w:val="16"/>
         </w:rPr>
-        <w:t>Neural Network</w:t>
-      </w:r>
-      <w:r>
-        <w:rPr>
-          <w:rFonts w:ascii="Times New Roman" w:hAnsi="Times New Roman" w:cs="Times New Roman"/>
-          <w:color w:val="000000" w:themeColor="text1"/>
-          <w:sz w:val="16"/>
-          <w:szCs w:val="16"/>
-        </w:rPr>
-        <w:t xml:space="preserve"> </w:t>
-      </w:r>
-      <w:r>
-        <w:rPr>
-          <w:rFonts w:ascii="Times New Roman" w:hAnsi="Times New Roman" w:cs="Times New Roman"/>
-          <w:color w:val="000000" w:themeColor="text1"/>
-          <w:sz w:val="16"/>
-          <w:szCs w:val="16"/>
-        </w:rPr>
-        <w:t xml:space="preserve">using </w:t>
+        <w:t>Logistic Regression and Random Forest</w:t>
+      </w:r>
+      <w:r>
+        <w:rPr>
+          <w:rFonts w:ascii="Times New Roman" w:hAnsi="Times New Roman" w:cs="Times New Roman"/>
+          <w:color w:val="000000" w:themeColor="text1"/>
+          <w:sz w:val="16"/>
+          <w:szCs w:val="16"/>
+        </w:rPr>
+        <w:t xml:space="preserve"> models to predict user conversion probability, compare model performance and generate a prediction using confidence through </w:t>
       </w:r>
       <w:r>
         <w:rPr>
@@ -1632,92 +1493,7 @@
           <w:sz w:val="16"/>
           <w:szCs w:val="16"/>
         </w:rPr>
-        <w:t>ResNet18</w:t>
-      </w:r>
-      <w:r>
-        <w:rPr>
-          <w:rFonts w:ascii="Times New Roman" w:hAnsi="Times New Roman" w:cs="Times New Roman"/>
-          <w:color w:val="000000" w:themeColor="text1"/>
-          <w:sz w:val="16"/>
-          <w:szCs w:val="16"/>
-        </w:rPr>
-        <w:t xml:space="preserve"> and </w:t>
-      </w:r>
-      <w:r>
-        <w:rPr>
-          <w:rFonts w:ascii="Times New Roman" w:hAnsi="Times New Roman" w:cs="Times New Roman"/>
-          <w:b/>
-          <w:bCs/>
-          <w:color w:val="000000" w:themeColor="text1"/>
-          <w:sz w:val="16"/>
-          <w:szCs w:val="16"/>
-        </w:rPr>
-        <w:t>Transfer Learning</w:t>
-      </w:r>
-      <w:r>
-        <w:rPr>
-          <w:rFonts w:ascii="Times New Roman" w:hAnsi="Times New Roman" w:cs="Times New Roman"/>
-          <w:color w:val="000000" w:themeColor="text1"/>
-          <w:sz w:val="16"/>
-          <w:szCs w:val="16"/>
-        </w:rPr>
-        <w:t xml:space="preserve"> achieving up to a </w:t>
-      </w:r>
-      <w:r>
-        <w:rPr>
-          <w:rFonts w:ascii="Times New Roman" w:hAnsi="Times New Roman" w:cs="Times New Roman"/>
-          <w:b/>
-          <w:bCs/>
-          <w:color w:val="000000" w:themeColor="text1"/>
-          <w:sz w:val="16"/>
-          <w:szCs w:val="16"/>
-        </w:rPr>
-        <w:t>94%</w:t>
-      </w:r>
-      <w:r>
-        <w:rPr>
-          <w:rFonts w:ascii="Times New Roman" w:hAnsi="Times New Roman" w:cs="Times New Roman"/>
-          <w:color w:val="000000" w:themeColor="text1"/>
-          <w:sz w:val="16"/>
-          <w:szCs w:val="16"/>
-        </w:rPr>
-        <w:t xml:space="preserve"> test accuracy through stage</w:t>
-      </w:r>
-      <w:r>
-        <w:rPr>
-          <w:rFonts w:ascii="Times New Roman" w:hAnsi="Times New Roman" w:cs="Times New Roman"/>
-          <w:color w:val="000000" w:themeColor="text1"/>
-          <w:sz w:val="16"/>
-          <w:szCs w:val="16"/>
-        </w:rPr>
-        <w:t>-</w:t>
-      </w:r>
-      <w:r>
-        <w:rPr>
-          <w:rFonts w:ascii="Times New Roman" w:hAnsi="Times New Roman" w:cs="Times New Roman"/>
-          <w:color w:val="000000" w:themeColor="text1"/>
-          <w:sz w:val="16"/>
-          <w:szCs w:val="16"/>
-        </w:rPr>
-        <w:t xml:space="preserve">based training, and </w:t>
-      </w:r>
-      <w:r>
-        <w:rPr>
-          <w:rFonts w:ascii="Times New Roman" w:hAnsi="Times New Roman" w:cs="Times New Roman"/>
-          <w:color w:val="000000" w:themeColor="text1"/>
-          <w:sz w:val="16"/>
-          <w:szCs w:val="16"/>
-        </w:rPr>
-        <w:t>fine</w:t>
-      </w:r>
-      <w:r>
-        <w:rPr>
-          <w:rFonts w:ascii="Times New Roman" w:hAnsi="Times New Roman" w:cs="Times New Roman"/>
-          <w:color w:val="000000" w:themeColor="text1"/>
-          <w:sz w:val="16"/>
-          <w:szCs w:val="16"/>
-        </w:rPr>
-        <w:t xml:space="preserve"> tuning.</w:t>
+        <w:t>ROC-AUC.</w:t>
       </w:r>
     </w:p>
     <w:p>
@@ -1726,7 +1502,7 @@
         <w:widowControl w:val="0"/>
         <w:numPr>
           <w:ilvl w:val="0"/>
-          <w:numId w:val="40"/>
+          <w:numId w:val="50"/>
         </w:numPr>
         <w:spacing w:after="0" w:line="240" w:lineRule="auto"/>
         <w:rPr>
@@ -1743,118 +1519,7 @@
           <w:sz w:val="16"/>
           <w:szCs w:val="16"/>
         </w:rPr>
-        <w:t xml:space="preserve">Implemented multiple baseline models including </w:t>
-      </w:r>
-      <w:r>
-        <w:rPr>
-          <w:rFonts w:ascii="Times New Roman" w:hAnsi="Times New Roman" w:cs="Times New Roman"/>
-          <w:b/>
-          <w:bCs/>
-          <w:color w:val="000000" w:themeColor="text1"/>
-          <w:sz w:val="16"/>
-          <w:szCs w:val="16"/>
-        </w:rPr>
-        <w:t xml:space="preserve">HOG + SVC, </w:t>
-      </w:r>
-      <w:r>
-        <w:rPr>
-          <w:rFonts w:ascii="Times New Roman" w:hAnsi="Times New Roman" w:cs="Times New Roman"/>
-          <w:b/>
-          <w:bCs/>
-          <w:color w:val="000000" w:themeColor="text1"/>
-          <w:sz w:val="16"/>
-          <w:szCs w:val="16"/>
-        </w:rPr>
-        <w:t>k-</w:t>
-      </w:r>
-      <w:r>
-        <w:rPr>
-          <w:rFonts w:ascii="Times New Roman" w:hAnsi="Times New Roman" w:cs="Times New Roman"/>
-          <w:b/>
-          <w:bCs/>
-          <w:color w:val="000000" w:themeColor="text1"/>
-          <w:sz w:val="16"/>
-          <w:szCs w:val="16"/>
-        </w:rPr>
-        <w:t xml:space="preserve">NN, and Random Forest </w:t>
-      </w:r>
-      <w:r>
-        <w:rPr>
-          <w:rFonts w:ascii="Times New Roman" w:hAnsi="Times New Roman" w:cs="Times New Roman"/>
-          <w:color w:val="000000" w:themeColor="text1"/>
-          <w:sz w:val="16"/>
-          <w:szCs w:val="16"/>
-        </w:rPr>
-        <w:t xml:space="preserve">models, and through </w:t>
-      </w:r>
-      <w:r>
-        <w:rPr>
-          <w:rFonts w:ascii="Times New Roman" w:hAnsi="Times New Roman" w:cs="Times New Roman"/>
-          <w:color w:val="000000" w:themeColor="text1"/>
-          <w:sz w:val="16"/>
-          <w:szCs w:val="16"/>
-        </w:rPr>
-        <w:t xml:space="preserve">hyperparameter tuning was able to improve model test accuracies from as low as </w:t>
-      </w:r>
-      <w:r>
-        <w:rPr>
-          <w:rFonts w:ascii="Times New Roman" w:hAnsi="Times New Roman" w:cs="Times New Roman"/>
-          <w:b/>
-          <w:bCs/>
-          <w:color w:val="000000" w:themeColor="text1"/>
-          <w:sz w:val="16"/>
-          <w:szCs w:val="16"/>
-        </w:rPr>
-        <w:t>77%</w:t>
-      </w:r>
-      <w:r>
-        <w:rPr>
-          <w:rFonts w:ascii="Times New Roman" w:hAnsi="Times New Roman" w:cs="Times New Roman"/>
-          <w:color w:val="000000" w:themeColor="text1"/>
-          <w:sz w:val="16"/>
-          <w:szCs w:val="16"/>
-        </w:rPr>
-        <w:t xml:space="preserve"> to as high as </w:t>
-      </w:r>
-      <w:r>
-        <w:rPr>
-          <w:rFonts w:ascii="Times New Roman" w:hAnsi="Times New Roman" w:cs="Times New Roman"/>
-          <w:b/>
-          <w:bCs/>
-          <w:color w:val="000000" w:themeColor="text1"/>
-          <w:sz w:val="16"/>
-          <w:szCs w:val="16"/>
-        </w:rPr>
-        <w:t>97%</w:t>
-      </w:r>
-      <w:r>
-        <w:rPr>
-          <w:rFonts w:ascii="Times New Roman" w:hAnsi="Times New Roman" w:cs="Times New Roman"/>
-          <w:color w:val="000000" w:themeColor="text1"/>
-          <w:sz w:val="16"/>
-          <w:szCs w:val="16"/>
-        </w:rPr>
-        <w:t xml:space="preserve"> </w:t>
-      </w:r>
-      <w:r>
-        <w:rPr>
-          <w:rFonts w:ascii="Times New Roman" w:hAnsi="Times New Roman" w:cs="Times New Roman"/>
-          <w:color w:val="000000" w:themeColor="text1"/>
-          <w:sz w:val="16"/>
-          <w:szCs w:val="16"/>
-        </w:rPr>
-        <w:t xml:space="preserve">improving overall model accuracies by </w:t>
-      </w:r>
-      <w:r>
-        <w:rPr>
-          <w:rFonts w:ascii="Times New Roman" w:hAnsi="Times New Roman" w:cs="Times New Roman"/>
-          <w:b/>
-          <w:bCs/>
-          <w:color w:val="000000" w:themeColor="text1"/>
-          <w:sz w:val="16"/>
-          <w:szCs w:val="16"/>
-        </w:rPr>
-        <w:t>10%-20%.</w:t>
+        <w:t>Engineered feature processing pipelines for user behaver data, that included data validation, transformation, and aggregation. Allowing for a robust analysis across both uploaded and generated datasets.</w:t>
       </w:r>
     </w:p>
     <w:p>
@@ -1863,7 +1528,7 @@
         <w:widowControl w:val="0"/>
         <w:numPr>
           <w:ilvl w:val="0"/>
-          <w:numId w:val="40"/>
+          <w:numId w:val="50"/>
         </w:numPr>
         <w:spacing w:after="0" w:line="240" w:lineRule="auto"/>
         <w:rPr>
@@ -1880,124 +1545,7 @@
           <w:sz w:val="16"/>
           <w:szCs w:val="16"/>
         </w:rPr>
-        <w:t xml:space="preserve">Evaluated models based </w:t>
-      </w:r>
-      <w:r>
-        <w:rPr>
-          <w:rFonts w:ascii="Times New Roman" w:hAnsi="Times New Roman" w:cs="Times New Roman"/>
-          <w:color w:val="000000" w:themeColor="text1"/>
-          <w:sz w:val="16"/>
-          <w:szCs w:val="16"/>
-        </w:rPr>
-        <w:t xml:space="preserve">statistical analysis using </w:t>
-      </w:r>
-      <w:r>
-        <w:rPr>
-          <w:rFonts w:ascii="Times New Roman" w:hAnsi="Times New Roman" w:cs="Times New Roman"/>
-          <w:color w:val="000000" w:themeColor="text1"/>
-          <w:sz w:val="16"/>
-          <w:szCs w:val="16"/>
-        </w:rPr>
-        <w:t>precision, recall, F1-</w:t>
-      </w:r>
-      <w:r>
-        <w:rPr>
-          <w:rFonts w:ascii="Times New Roman" w:hAnsi="Times New Roman" w:cs="Times New Roman"/>
-          <w:color w:val="000000" w:themeColor="text1"/>
-          <w:sz w:val="16"/>
-          <w:szCs w:val="16"/>
-        </w:rPr>
-        <w:t>s</w:t>
-      </w:r>
-      <w:r>
-        <w:rPr>
-          <w:rFonts w:ascii="Times New Roman" w:hAnsi="Times New Roman" w:cs="Times New Roman"/>
-          <w:color w:val="000000" w:themeColor="text1"/>
-          <w:sz w:val="16"/>
-          <w:szCs w:val="16"/>
-        </w:rPr>
-        <w:t xml:space="preserve">core, and </w:t>
-      </w:r>
-      <w:r>
-        <w:rPr>
-          <w:rFonts w:ascii="Times New Roman" w:hAnsi="Times New Roman" w:cs="Times New Roman"/>
-          <w:color w:val="000000" w:themeColor="text1"/>
-          <w:sz w:val="16"/>
-          <w:szCs w:val="16"/>
-        </w:rPr>
-        <w:t>m</w:t>
-      </w:r>
-      <w:r>
-        <w:rPr>
-          <w:rFonts w:ascii="Times New Roman" w:hAnsi="Times New Roman" w:cs="Times New Roman"/>
-          <w:color w:val="000000" w:themeColor="text1"/>
-          <w:sz w:val="16"/>
-          <w:szCs w:val="16"/>
-        </w:rPr>
-        <w:t xml:space="preserve">atplot for </w:t>
-      </w:r>
-      <w:r>
-        <w:rPr>
-          <w:rFonts w:ascii="Times New Roman" w:hAnsi="Times New Roman" w:cs="Times New Roman"/>
-          <w:color w:val="000000" w:themeColor="text1"/>
-          <w:sz w:val="16"/>
-          <w:szCs w:val="16"/>
-        </w:rPr>
-        <w:t>c</w:t>
-      </w:r>
-      <w:r>
-        <w:rPr>
-          <w:rFonts w:ascii="Times New Roman" w:hAnsi="Times New Roman" w:cs="Times New Roman"/>
-          <w:color w:val="000000" w:themeColor="text1"/>
-          <w:sz w:val="16"/>
-          <w:szCs w:val="16"/>
-        </w:rPr>
-        <w:t xml:space="preserve">onfusion </w:t>
-      </w:r>
-      <w:r>
-        <w:rPr>
-          <w:rFonts w:ascii="Times New Roman" w:hAnsi="Times New Roman" w:cs="Times New Roman"/>
-          <w:color w:val="000000" w:themeColor="text1"/>
-          <w:sz w:val="16"/>
-          <w:szCs w:val="16"/>
-        </w:rPr>
-        <w:t>m</w:t>
-      </w:r>
-      <w:r>
-        <w:rPr>
-          <w:rFonts w:ascii="Times New Roman" w:hAnsi="Times New Roman" w:cs="Times New Roman"/>
-          <w:color w:val="000000" w:themeColor="text1"/>
-          <w:sz w:val="16"/>
-          <w:szCs w:val="16"/>
-        </w:rPr>
-        <w:t>atrices</w:t>
-      </w:r>
-      <w:r>
-        <w:rPr>
-          <w:rFonts w:ascii="Times New Roman" w:hAnsi="Times New Roman" w:cs="Times New Roman"/>
-          <w:color w:val="000000" w:themeColor="text1"/>
-          <w:sz w:val="16"/>
-          <w:szCs w:val="16"/>
-        </w:rPr>
-        <w:t xml:space="preserve"> </w:t>
-      </w:r>
-      <w:r>
-        <w:rPr>
-          <w:rFonts w:ascii="Times New Roman" w:hAnsi="Times New Roman" w:cs="Times New Roman"/>
-          <w:color w:val="000000" w:themeColor="text1"/>
-          <w:sz w:val="16"/>
-          <w:szCs w:val="16"/>
-        </w:rPr>
-        <w:t>visualization</w:t>
-      </w:r>
-      <w:r>
-        <w:rPr>
-          <w:rFonts w:ascii="Times New Roman" w:hAnsi="Times New Roman" w:cs="Times New Roman"/>
-          <w:color w:val="000000" w:themeColor="text1"/>
-          <w:sz w:val="16"/>
-          <w:szCs w:val="16"/>
-        </w:rPr>
-        <w:t xml:space="preserve"> to analyze class level errors to better tailor optimizations and improve accuracies</w:t>
+        <w:t>Built a decision engine that uses statistical results and ML predictions to produce a rollout recommendation based on significance, lift, and confidence.</w:t>
       </w:r>
     </w:p>
     <w:p>
@@ -2006,7 +1554,7 @@
         <w:widowControl w:val="0"/>
         <w:numPr>
           <w:ilvl w:val="0"/>
-          <w:numId w:val="40"/>
+          <w:numId w:val="50"/>
         </w:numPr>
         <w:spacing w:after="0" w:line="240" w:lineRule="auto"/>
         <w:rPr>
@@ -2023,16 +1571,7 @@
           <w:sz w:val="16"/>
           <w:szCs w:val="16"/>
         </w:rPr>
-        <w:t>Engineered data preprocessing and augmentation pipelines, including normalization and standardization of the image features</w:t>
-      </w:r>
-      <w:r>
-        <w:rPr>
-          <w:rFonts w:ascii="Times New Roman" w:hAnsi="Times New Roman" w:cs="Times New Roman"/>
-          <w:color w:val="000000" w:themeColor="text1"/>
-          <w:sz w:val="16"/>
-          <w:szCs w:val="16"/>
-        </w:rPr>
-        <w:t>.</w:t>
+        <w:t>Developed a Streamlit dashboard and CLI intercave to visualize experiment results including conversion rates, confidence intervals, and comparisons between models, giving a user-friendly system for data driven decisions.</w:t>
       </w:r>
     </w:p>
     <w:p>
@@ -2085,51 +1624,7 @@
           <w:sz w:val="16"/>
           <w:szCs w:val="16"/>
         </w:rPr>
-        <w:t xml:space="preserve"> (Python, scikit</w:t>
-      </w:r>
-      <w:r>
-        <w:rPr>
-          <w:rFonts w:ascii="Times New Roman" w:hAnsi="Times New Roman" w:cs="Times New Roman"/>
-          <w:b/>
-          <w:bCs/>
-          <w:color w:val="000000" w:themeColor="text1"/>
-          <w:sz w:val="16"/>
-          <w:szCs w:val="16"/>
-        </w:rPr>
-        <w:t>-</w:t>
-      </w:r>
-      <w:r>
-        <w:rPr>
-          <w:rFonts w:ascii="Times New Roman" w:hAnsi="Times New Roman" w:cs="Times New Roman"/>
-          <w:b/>
-          <w:bCs/>
-          <w:color w:val="000000" w:themeColor="text1"/>
-          <w:sz w:val="16"/>
-          <w:szCs w:val="16"/>
-        </w:rPr>
-        <w:t>learn,</w:t>
-      </w:r>
-      <w:r>
-        <w:rPr>
-          <w:rFonts w:ascii="Times New Roman" w:hAnsi="Times New Roman" w:cs="Times New Roman"/>
-          <w:b/>
-          <w:bCs/>
-          <w:color w:val="000000" w:themeColor="text1"/>
-          <w:sz w:val="16"/>
-          <w:szCs w:val="16"/>
-        </w:rPr>
-        <w:t xml:space="preserve"> </w:t>
-      </w:r>
-      <w:r>
-        <w:rPr>
-          <w:rFonts w:ascii="Times New Roman" w:hAnsi="Times New Roman" w:cs="Times New Roman"/>
-          <w:b/>
-          <w:bCs/>
-          <w:color w:val="000000" w:themeColor="text1"/>
-          <w:sz w:val="16"/>
-          <w:szCs w:val="16"/>
-        </w:rPr>
-        <w:t>YAML)</w:t>
+        <w:t xml:space="preserve"> (Python, scikit-learn, YAML)</w:t>
       </w:r>
     </w:p>
     <w:p>
@@ -2201,25 +1696,7 @@
           <w:sz w:val="16"/>
           <w:szCs w:val="16"/>
         </w:rPr>
-        <w:t xml:space="preserve">Implemented </w:t>
-      </w:r>
-      <w:r>
-        <w:rPr>
-          <w:rFonts w:ascii="Times New Roman" w:hAnsi="Times New Roman" w:cs="Times New Roman"/>
-          <w:color w:val="000000" w:themeColor="text1"/>
-          <w:sz w:val="16"/>
-          <w:szCs w:val="16"/>
-        </w:rPr>
-        <w:t xml:space="preserve">a </w:t>
-      </w:r>
-      <w:r>
-        <w:rPr>
-          <w:rFonts w:ascii="Times New Roman" w:hAnsi="Times New Roman" w:cs="Times New Roman"/>
-          <w:color w:val="000000" w:themeColor="text1"/>
-          <w:sz w:val="16"/>
-          <w:szCs w:val="16"/>
-        </w:rPr>
-        <w:t xml:space="preserve">pipeline covering synthetic dataset generation, text preprocessing, </w:t>
+        <w:t xml:space="preserve">Implemented a pipeline covering synthetic dataset generation, text preprocessing, </w:t>
       </w:r>
       <w:r>
         <w:rPr>
@@ -2336,8 +1813,10 @@
     </w:p>
     <w:p>
       <w:pPr>
+        <w:pStyle w:val="ListParagraph"/>
         <w:widowControl w:val="0"/>
         <w:spacing w:after="0" w:line="240" w:lineRule="auto"/>
+        <w:ind w:left="720" w:firstLine="0"/>
         <w:rPr>
           <w:rFonts w:ascii="Times New Roman" w:hAnsi="Times New Roman" w:cs="Times New Roman"/>
           <w:color w:val="000000" w:themeColor="text1"/>
@@ -2359,6 +1838,20 @@
           <w:szCs w:val="16"/>
         </w:rPr>
       </w:pPr>
+      <w:hyperlink r:id="rId13" w:history="1">
+        <w:r>
+          <w:rPr>
+            <w:rStyle w:val="Hyperlink"/>
+            <w:rFonts w:ascii="Times New Roman" w:hAnsi="Times New Roman" w:cs="Times New Roman"/>
+            <w:b/>
+            <w:bCs/>
+            <w:color w:val="000000" w:themeColor="text1"/>
+            <w:sz w:val="16"/>
+            <w:szCs w:val="16"/>
+          </w:rPr>
+          <w:t>Traffic Sign Image Recognition System</w:t>
+        </w:r>
+      </w:hyperlink>
       <w:r>
         <w:rPr>
           <w:rFonts w:ascii="Times New Roman" w:hAnsi="Times New Roman" w:cs="Times New Roman"/>
@@ -2367,9 +1860,8 @@
           <w:color w:val="000000" w:themeColor="text1"/>
           <w:sz w:val="16"/>
           <w:szCs w:val="16"/>
-          <w:u w:val="single"/>
-        </w:rPr>
-        <w:t>A/B Testing Engine</w:t>
+        </w:rPr>
+        <w:t xml:space="preserve"> (Python, PyTorch, scikit</w:t>
       </w:r>
       <w:r>
         <w:rPr>
@@ -2380,7 +1872,7 @@
           <w:sz w:val="16"/>
           <w:szCs w:val="16"/>
         </w:rPr>
-        <w:t xml:space="preserve"> </w:t>
+        <w:t>-l</w:t>
       </w:r>
       <w:r>
         <w:rPr>
@@ -2391,7 +1883,53 @@
           <w:sz w:val="16"/>
           <w:szCs w:val="16"/>
         </w:rPr>
-        <w:t>(Python, Streamlit, scikit-learn, Pandas, NumPy, SciPy, Plotly)</w:t>
+        <w:t>earn, OpenCV</w:t>
+      </w:r>
+      <w:r>
+        <w:rPr>
+          <w:rFonts w:ascii="Times New Roman" w:hAnsi="Times New Roman" w:cs="Times New Roman"/>
+          <w:b/>
+          <w:bCs/>
+          <w:color w:val="000000" w:themeColor="text1"/>
+          <w:sz w:val="16"/>
+          <w:szCs w:val="16"/>
+        </w:rPr>
+        <w:t xml:space="preserve">, Pandas, NumPy, </w:t>
+      </w:r>
+      <w:proofErr w:type="spellStart"/>
+      <w:r>
+        <w:rPr>
+          <w:rFonts w:ascii="Times New Roman" w:hAnsi="Times New Roman" w:cs="Times New Roman"/>
+          <w:b/>
+          <w:bCs/>
+          <w:color w:val="000000" w:themeColor="text1"/>
+          <w:sz w:val="16"/>
+          <w:szCs w:val="16"/>
+        </w:rPr>
+        <w:t>Torchvision</w:t>
+      </w:r>
+      <w:proofErr w:type="spellEnd"/>
+      <w:r>
+        <w:rPr>
+          <w:rFonts w:ascii="Times New Roman" w:hAnsi="Times New Roman" w:cs="Times New Roman"/>
+          <w:b/>
+          <w:bCs/>
+          <w:color w:val="000000" w:themeColor="text1"/>
+          <w:sz w:val="16"/>
+          <w:szCs w:val="16"/>
+        </w:rPr>
+        <w:t>, Matplotlib</w:t>
+      </w:r>
+      <w:r>
+        <w:rPr>
+          <w:rFonts w:ascii="Times New Roman" w:hAnsi="Times New Roman" w:cs="Times New Roman"/>
+          <w:b/>
+          <w:bCs/>
+          <w:color w:val="000000" w:themeColor="text1"/>
+          <w:sz w:val="16"/>
+          <w:szCs w:val="16"/>
+        </w:rPr>
+        <w:t xml:space="preserve">) </w:t>
       </w:r>
     </w:p>
     <w:p>
@@ -2400,7 +1938,7 @@
         <w:widowControl w:val="0"/>
         <w:numPr>
           <w:ilvl w:val="0"/>
-          <w:numId w:val="50"/>
+          <w:numId w:val="40"/>
         </w:numPr>
         <w:spacing w:after="0" w:line="240" w:lineRule="auto"/>
         <w:rPr>
@@ -2417,16 +1955,54 @@
           <w:sz w:val="16"/>
           <w:szCs w:val="16"/>
         </w:rPr>
-        <w:t xml:space="preserve">Designed </w:t>
-      </w:r>
-      <w:r>
-        <w:rPr>
-          <w:rFonts w:ascii="Times New Roman" w:hAnsi="Times New Roman" w:cs="Times New Roman"/>
-          <w:color w:val="000000" w:themeColor="text1"/>
-          <w:sz w:val="16"/>
-          <w:szCs w:val="16"/>
-        </w:rPr>
-        <w:t>an end-to-end experimentation analytics platform that uses real, and simulated A/B testing data to preform statistical significance testing using two proportion z-tests and t-tests to evaluate features.</w:t>
+        <w:t xml:space="preserve">Built an image recognition and classification </w:t>
+      </w:r>
+      <w:r>
+        <w:rPr>
+          <w:rFonts w:ascii="Times New Roman" w:hAnsi="Times New Roman" w:cs="Times New Roman"/>
+          <w:color w:val="000000" w:themeColor="text1"/>
+          <w:sz w:val="16"/>
+          <w:szCs w:val="16"/>
+        </w:rPr>
+        <w:t>models</w:t>
+      </w:r>
+      <w:r>
+        <w:rPr>
+          <w:rFonts w:ascii="Times New Roman" w:hAnsi="Times New Roman" w:cs="Times New Roman"/>
+          <w:color w:val="000000" w:themeColor="text1"/>
+          <w:sz w:val="16"/>
+          <w:szCs w:val="16"/>
+        </w:rPr>
+        <w:t xml:space="preserve"> for </w:t>
+      </w:r>
+      <w:r>
+        <w:rPr>
+          <w:rFonts w:ascii="Times New Roman" w:hAnsi="Times New Roman" w:cs="Times New Roman"/>
+          <w:b/>
+          <w:bCs/>
+          <w:color w:val="000000" w:themeColor="text1"/>
+          <w:sz w:val="16"/>
+          <w:szCs w:val="16"/>
+        </w:rPr>
+        <w:t>43</w:t>
+      </w:r>
+      <w:r>
+        <w:rPr>
+          <w:rFonts w:ascii="Times New Roman" w:hAnsi="Times New Roman" w:cs="Times New Roman"/>
+          <w:color w:val="000000" w:themeColor="text1"/>
+          <w:sz w:val="16"/>
+          <w:szCs w:val="16"/>
+        </w:rPr>
+        <w:t xml:space="preserve"> traffic sign classes using the GTSRB dataset, training, evaluating, and optimizing multiple machine learning models</w:t>
+      </w:r>
+      <w:r>
+        <w:rPr>
+          <w:rFonts w:ascii="Times New Roman" w:hAnsi="Times New Roman" w:cs="Times New Roman"/>
+          <w:color w:val="000000" w:themeColor="text1"/>
+          <w:sz w:val="16"/>
+          <w:szCs w:val="16"/>
+        </w:rPr>
+        <w:t>.</w:t>
       </w:r>
     </w:p>
     <w:p>
@@ -2435,7 +2011,7 @@
         <w:widowControl w:val="0"/>
         <w:numPr>
           <w:ilvl w:val="0"/>
-          <w:numId w:val="50"/>
+          <w:numId w:val="40"/>
         </w:numPr>
         <w:spacing w:after="0" w:line="240" w:lineRule="auto"/>
         <w:rPr>
@@ -2452,7 +2028,7 @@
           <w:sz w:val="16"/>
           <w:szCs w:val="16"/>
         </w:rPr>
-        <w:t xml:space="preserve">Implemented a hybrid modeling system the combines </w:t>
+        <w:t xml:space="preserve">Developed a </w:t>
       </w:r>
       <w:r>
         <w:rPr>
@@ -2463,16 +2039,25 @@
           <w:sz w:val="16"/>
           <w:szCs w:val="16"/>
         </w:rPr>
-        <w:t>Logistic Regression and Random Forest</w:t>
-      </w:r>
-      <w:r>
-        <w:rPr>
-          <w:rFonts w:ascii="Times New Roman" w:hAnsi="Times New Roman" w:cs="Times New Roman"/>
-          <w:color w:val="000000" w:themeColor="text1"/>
-          <w:sz w:val="16"/>
-          <w:szCs w:val="16"/>
-        </w:rPr>
-        <w:t xml:space="preserve"> models to predict user conversion probability, compare model performance and generate a prediction using confidence through </w:t>
+        <w:t>Neural Network</w:t>
+      </w:r>
+      <w:r>
+        <w:rPr>
+          <w:rFonts w:ascii="Times New Roman" w:hAnsi="Times New Roman" w:cs="Times New Roman"/>
+          <w:color w:val="000000" w:themeColor="text1"/>
+          <w:sz w:val="16"/>
+          <w:szCs w:val="16"/>
+        </w:rPr>
+        <w:t xml:space="preserve"> </w:t>
+      </w:r>
+      <w:r>
+        <w:rPr>
+          <w:rFonts w:ascii="Times New Roman" w:hAnsi="Times New Roman" w:cs="Times New Roman"/>
+          <w:color w:val="000000" w:themeColor="text1"/>
+          <w:sz w:val="16"/>
+          <w:szCs w:val="16"/>
+        </w:rPr>
+        <w:t xml:space="preserve">using </w:t>
       </w:r>
       <w:r>
         <w:rPr>
@@ -2483,7 +2068,92 @@
           <w:sz w:val="16"/>
           <w:szCs w:val="16"/>
         </w:rPr>
-        <w:t>ROC-AUC.</w:t>
+        <w:t>ResNet18</w:t>
+      </w:r>
+      <w:r>
+        <w:rPr>
+          <w:rFonts w:ascii="Times New Roman" w:hAnsi="Times New Roman" w:cs="Times New Roman"/>
+          <w:color w:val="000000" w:themeColor="text1"/>
+          <w:sz w:val="16"/>
+          <w:szCs w:val="16"/>
+        </w:rPr>
+        <w:t xml:space="preserve"> and </w:t>
+      </w:r>
+      <w:r>
+        <w:rPr>
+          <w:rFonts w:ascii="Times New Roman" w:hAnsi="Times New Roman" w:cs="Times New Roman"/>
+          <w:b/>
+          <w:bCs/>
+          <w:color w:val="000000" w:themeColor="text1"/>
+          <w:sz w:val="16"/>
+          <w:szCs w:val="16"/>
+        </w:rPr>
+        <w:t>Transfer Learning</w:t>
+      </w:r>
+      <w:r>
+        <w:rPr>
+          <w:rFonts w:ascii="Times New Roman" w:hAnsi="Times New Roman" w:cs="Times New Roman"/>
+          <w:color w:val="000000" w:themeColor="text1"/>
+          <w:sz w:val="16"/>
+          <w:szCs w:val="16"/>
+        </w:rPr>
+        <w:t xml:space="preserve"> achieving up to a </w:t>
+      </w:r>
+      <w:r>
+        <w:rPr>
+          <w:rFonts w:ascii="Times New Roman" w:hAnsi="Times New Roman" w:cs="Times New Roman"/>
+          <w:b/>
+          <w:bCs/>
+          <w:color w:val="000000" w:themeColor="text1"/>
+          <w:sz w:val="16"/>
+          <w:szCs w:val="16"/>
+        </w:rPr>
+        <w:t>94%</w:t>
+      </w:r>
+      <w:r>
+        <w:rPr>
+          <w:rFonts w:ascii="Times New Roman" w:hAnsi="Times New Roman" w:cs="Times New Roman"/>
+          <w:color w:val="000000" w:themeColor="text1"/>
+          <w:sz w:val="16"/>
+          <w:szCs w:val="16"/>
+        </w:rPr>
+        <w:t xml:space="preserve"> test accuracy through stage</w:t>
+      </w:r>
+      <w:r>
+        <w:rPr>
+          <w:rFonts w:ascii="Times New Roman" w:hAnsi="Times New Roman" w:cs="Times New Roman"/>
+          <w:color w:val="000000" w:themeColor="text1"/>
+          <w:sz w:val="16"/>
+          <w:szCs w:val="16"/>
+        </w:rPr>
+        <w:t>-</w:t>
+      </w:r>
+      <w:r>
+        <w:rPr>
+          <w:rFonts w:ascii="Times New Roman" w:hAnsi="Times New Roman" w:cs="Times New Roman"/>
+          <w:color w:val="000000" w:themeColor="text1"/>
+          <w:sz w:val="16"/>
+          <w:szCs w:val="16"/>
+        </w:rPr>
+        <w:t xml:space="preserve">based training, and </w:t>
+      </w:r>
+      <w:r>
+        <w:rPr>
+          <w:rFonts w:ascii="Times New Roman" w:hAnsi="Times New Roman" w:cs="Times New Roman"/>
+          <w:color w:val="000000" w:themeColor="text1"/>
+          <w:sz w:val="16"/>
+          <w:szCs w:val="16"/>
+        </w:rPr>
+        <w:t>fine</w:t>
+      </w:r>
+      <w:r>
+        <w:rPr>
+          <w:rFonts w:ascii="Times New Roman" w:hAnsi="Times New Roman" w:cs="Times New Roman"/>
+          <w:color w:val="000000" w:themeColor="text1"/>
+          <w:sz w:val="16"/>
+          <w:szCs w:val="16"/>
+        </w:rPr>
+        <w:t xml:space="preserve"> tuning.</w:t>
       </w:r>
     </w:p>
     <w:p>
@@ -2492,7 +2162,7 @@
         <w:widowControl w:val="0"/>
         <w:numPr>
           <w:ilvl w:val="0"/>
-          <w:numId w:val="50"/>
+          <w:numId w:val="40"/>
         </w:numPr>
         <w:spacing w:after="0" w:line="240" w:lineRule="auto"/>
         <w:rPr>
@@ -2509,7 +2179,118 @@
           <w:sz w:val="16"/>
           <w:szCs w:val="16"/>
         </w:rPr>
-        <w:t>Engineered feature processing pipelines for user behaver data, that included data validation, transformation, and aggregation. Allowing for a robust analysis across both uploaded and generated datasets.</w:t>
+        <w:t xml:space="preserve">Implemented multiple baseline models including </w:t>
+      </w:r>
+      <w:r>
+        <w:rPr>
+          <w:rFonts w:ascii="Times New Roman" w:hAnsi="Times New Roman" w:cs="Times New Roman"/>
+          <w:b/>
+          <w:bCs/>
+          <w:color w:val="000000" w:themeColor="text1"/>
+          <w:sz w:val="16"/>
+          <w:szCs w:val="16"/>
+        </w:rPr>
+        <w:t xml:space="preserve">HOG + SVC, </w:t>
+      </w:r>
+      <w:r>
+        <w:rPr>
+          <w:rFonts w:ascii="Times New Roman" w:hAnsi="Times New Roman" w:cs="Times New Roman"/>
+          <w:b/>
+          <w:bCs/>
+          <w:color w:val="000000" w:themeColor="text1"/>
+          <w:sz w:val="16"/>
+          <w:szCs w:val="16"/>
+        </w:rPr>
+        <w:t>k-</w:t>
+      </w:r>
+      <w:r>
+        <w:rPr>
+          <w:rFonts w:ascii="Times New Roman" w:hAnsi="Times New Roman" w:cs="Times New Roman"/>
+          <w:b/>
+          <w:bCs/>
+          <w:color w:val="000000" w:themeColor="text1"/>
+          <w:sz w:val="16"/>
+          <w:szCs w:val="16"/>
+        </w:rPr>
+        <w:t xml:space="preserve">NN, and Random Forest </w:t>
+      </w:r>
+      <w:r>
+        <w:rPr>
+          <w:rFonts w:ascii="Times New Roman" w:hAnsi="Times New Roman" w:cs="Times New Roman"/>
+          <w:color w:val="000000" w:themeColor="text1"/>
+          <w:sz w:val="16"/>
+          <w:szCs w:val="16"/>
+        </w:rPr>
+        <w:t xml:space="preserve">models, and through </w:t>
+      </w:r>
+      <w:r>
+        <w:rPr>
+          <w:rFonts w:ascii="Times New Roman" w:hAnsi="Times New Roman" w:cs="Times New Roman"/>
+          <w:color w:val="000000" w:themeColor="text1"/>
+          <w:sz w:val="16"/>
+          <w:szCs w:val="16"/>
+        </w:rPr>
+        <w:t xml:space="preserve">hyperparameter tuning was able to improve model test accuracies from as low as </w:t>
+      </w:r>
+      <w:r>
+        <w:rPr>
+          <w:rFonts w:ascii="Times New Roman" w:hAnsi="Times New Roman" w:cs="Times New Roman"/>
+          <w:b/>
+          <w:bCs/>
+          <w:color w:val="000000" w:themeColor="text1"/>
+          <w:sz w:val="16"/>
+          <w:szCs w:val="16"/>
+        </w:rPr>
+        <w:t>77%</w:t>
+      </w:r>
+      <w:r>
+        <w:rPr>
+          <w:rFonts w:ascii="Times New Roman" w:hAnsi="Times New Roman" w:cs="Times New Roman"/>
+          <w:color w:val="000000" w:themeColor="text1"/>
+          <w:sz w:val="16"/>
+          <w:szCs w:val="16"/>
+        </w:rPr>
+        <w:t xml:space="preserve"> to as high as </w:t>
+      </w:r>
+      <w:r>
+        <w:rPr>
+          <w:rFonts w:ascii="Times New Roman" w:hAnsi="Times New Roman" w:cs="Times New Roman"/>
+          <w:b/>
+          <w:bCs/>
+          <w:color w:val="000000" w:themeColor="text1"/>
+          <w:sz w:val="16"/>
+          <w:szCs w:val="16"/>
+        </w:rPr>
+        <w:t>97%</w:t>
+      </w:r>
+      <w:r>
+        <w:rPr>
+          <w:rFonts w:ascii="Times New Roman" w:hAnsi="Times New Roman" w:cs="Times New Roman"/>
+          <w:color w:val="000000" w:themeColor="text1"/>
+          <w:sz w:val="16"/>
+          <w:szCs w:val="16"/>
+        </w:rPr>
+        <w:t xml:space="preserve"> </w:t>
+      </w:r>
+      <w:r>
+        <w:rPr>
+          <w:rFonts w:ascii="Times New Roman" w:hAnsi="Times New Roman" w:cs="Times New Roman"/>
+          <w:color w:val="000000" w:themeColor="text1"/>
+          <w:sz w:val="16"/>
+          <w:szCs w:val="16"/>
+        </w:rPr>
+        <w:t xml:space="preserve">improving overall model accuracies by </w:t>
+      </w:r>
+      <w:r>
+        <w:rPr>
+          <w:rFonts w:ascii="Times New Roman" w:hAnsi="Times New Roman" w:cs="Times New Roman"/>
+          <w:b/>
+          <w:bCs/>
+          <w:color w:val="000000" w:themeColor="text1"/>
+          <w:sz w:val="16"/>
+          <w:szCs w:val="16"/>
+        </w:rPr>
+        <w:t>10%-20%.</w:t>
       </w:r>
     </w:p>
     <w:p>
@@ -2518,7 +2299,7 @@
         <w:widowControl w:val="0"/>
         <w:numPr>
           <w:ilvl w:val="0"/>
-          <w:numId w:val="50"/>
+          <w:numId w:val="40"/>
         </w:numPr>
         <w:spacing w:after="0" w:line="240" w:lineRule="auto"/>
         <w:rPr>
@@ -2535,7 +2316,124 @@
           <w:sz w:val="16"/>
           <w:szCs w:val="16"/>
         </w:rPr>
-        <w:t>Built a decision engine that uses statistical results and ML predictions to produce a rollout recommendation based on significance, lift, and confidence.</w:t>
+        <w:t xml:space="preserve">Evaluated models based </w:t>
+      </w:r>
+      <w:r>
+        <w:rPr>
+          <w:rFonts w:ascii="Times New Roman" w:hAnsi="Times New Roman" w:cs="Times New Roman"/>
+          <w:color w:val="000000" w:themeColor="text1"/>
+          <w:sz w:val="16"/>
+          <w:szCs w:val="16"/>
+        </w:rPr>
+        <w:t xml:space="preserve">statistical analysis using </w:t>
+      </w:r>
+      <w:r>
+        <w:rPr>
+          <w:rFonts w:ascii="Times New Roman" w:hAnsi="Times New Roman" w:cs="Times New Roman"/>
+          <w:color w:val="000000" w:themeColor="text1"/>
+          <w:sz w:val="16"/>
+          <w:szCs w:val="16"/>
+        </w:rPr>
+        <w:t>precision, recall, F1-</w:t>
+      </w:r>
+      <w:r>
+        <w:rPr>
+          <w:rFonts w:ascii="Times New Roman" w:hAnsi="Times New Roman" w:cs="Times New Roman"/>
+          <w:color w:val="000000" w:themeColor="text1"/>
+          <w:sz w:val="16"/>
+          <w:szCs w:val="16"/>
+        </w:rPr>
+        <w:t>s</w:t>
+      </w:r>
+      <w:r>
+        <w:rPr>
+          <w:rFonts w:ascii="Times New Roman" w:hAnsi="Times New Roman" w:cs="Times New Roman"/>
+          <w:color w:val="000000" w:themeColor="text1"/>
+          <w:sz w:val="16"/>
+          <w:szCs w:val="16"/>
+        </w:rPr>
+        <w:t xml:space="preserve">core, and </w:t>
+      </w:r>
+      <w:r>
+        <w:rPr>
+          <w:rFonts w:ascii="Times New Roman" w:hAnsi="Times New Roman" w:cs="Times New Roman"/>
+          <w:color w:val="000000" w:themeColor="text1"/>
+          <w:sz w:val="16"/>
+          <w:szCs w:val="16"/>
+        </w:rPr>
+        <w:t>m</w:t>
+      </w:r>
+      <w:r>
+        <w:rPr>
+          <w:rFonts w:ascii="Times New Roman" w:hAnsi="Times New Roman" w:cs="Times New Roman"/>
+          <w:color w:val="000000" w:themeColor="text1"/>
+          <w:sz w:val="16"/>
+          <w:szCs w:val="16"/>
+        </w:rPr>
+        <w:t xml:space="preserve">atplot for </w:t>
+      </w:r>
+      <w:r>
+        <w:rPr>
+          <w:rFonts w:ascii="Times New Roman" w:hAnsi="Times New Roman" w:cs="Times New Roman"/>
+          <w:color w:val="000000" w:themeColor="text1"/>
+          <w:sz w:val="16"/>
+          <w:szCs w:val="16"/>
+        </w:rPr>
+        <w:t>c</w:t>
+      </w:r>
+      <w:r>
+        <w:rPr>
+          <w:rFonts w:ascii="Times New Roman" w:hAnsi="Times New Roman" w:cs="Times New Roman"/>
+          <w:color w:val="000000" w:themeColor="text1"/>
+          <w:sz w:val="16"/>
+          <w:szCs w:val="16"/>
+        </w:rPr>
+        <w:t xml:space="preserve">onfusion </w:t>
+      </w:r>
+      <w:r>
+        <w:rPr>
+          <w:rFonts w:ascii="Times New Roman" w:hAnsi="Times New Roman" w:cs="Times New Roman"/>
+          <w:color w:val="000000" w:themeColor="text1"/>
+          <w:sz w:val="16"/>
+          <w:szCs w:val="16"/>
+        </w:rPr>
+        <w:t>m</w:t>
+      </w:r>
+      <w:r>
+        <w:rPr>
+          <w:rFonts w:ascii="Times New Roman" w:hAnsi="Times New Roman" w:cs="Times New Roman"/>
+          <w:color w:val="000000" w:themeColor="text1"/>
+          <w:sz w:val="16"/>
+          <w:szCs w:val="16"/>
+        </w:rPr>
+        <w:t>atrices</w:t>
+      </w:r>
+      <w:r>
+        <w:rPr>
+          <w:rFonts w:ascii="Times New Roman" w:hAnsi="Times New Roman" w:cs="Times New Roman"/>
+          <w:color w:val="000000" w:themeColor="text1"/>
+          <w:sz w:val="16"/>
+          <w:szCs w:val="16"/>
+        </w:rPr>
+        <w:t xml:space="preserve"> </w:t>
+      </w:r>
+      <w:r>
+        <w:rPr>
+          <w:rFonts w:ascii="Times New Roman" w:hAnsi="Times New Roman" w:cs="Times New Roman"/>
+          <w:color w:val="000000" w:themeColor="text1"/>
+          <w:sz w:val="16"/>
+          <w:szCs w:val="16"/>
+        </w:rPr>
+        <w:t>visualization</w:t>
+      </w:r>
+      <w:r>
+        <w:rPr>
+          <w:rFonts w:ascii="Times New Roman" w:hAnsi="Times New Roman" w:cs="Times New Roman"/>
+          <w:color w:val="000000" w:themeColor="text1"/>
+          <w:sz w:val="16"/>
+          <w:szCs w:val="16"/>
+        </w:rPr>
+        <w:t xml:space="preserve"> to analyze class level errors to better tailor optimizations and improve accuracies</w:t>
       </w:r>
     </w:p>
     <w:p>
@@ -2544,7 +2442,7 @@
         <w:widowControl w:val="0"/>
         <w:numPr>
           <w:ilvl w:val="0"/>
-          <w:numId w:val="50"/>
+          <w:numId w:val="40"/>
         </w:numPr>
         <w:spacing w:after="0" w:line="240" w:lineRule="auto"/>
         <w:rPr>
@@ -2561,8 +2459,29 @@
           <w:sz w:val="16"/>
           <w:szCs w:val="16"/>
         </w:rPr>
-        <w:t>Developed a Streamlit dashboard and CLI intercave to visualize experiment results including conversion rates, confidence intervals, and comparisons between models, giving a user-friendly system for data driven decisions.</w:t>
-      </w:r>
+        <w:t>Engineered data preprocessing and augmentation pipelines, including normalization and standardization of the image features</w:t>
+      </w:r>
+      <w:r>
+        <w:rPr>
+          <w:rFonts w:ascii="Times New Roman" w:hAnsi="Times New Roman" w:cs="Times New Roman"/>
+          <w:color w:val="000000" w:themeColor="text1"/>
+          <w:sz w:val="16"/>
+          <w:szCs w:val="16"/>
+        </w:rPr>
+        <w:t>.</w:t>
+      </w:r>
+    </w:p>
+    <w:p>
+      <w:pPr>
+        <w:widowControl w:val="0"/>
+        <w:spacing w:after="0" w:line="240" w:lineRule="auto"/>
+        <w:rPr>
+          <w:rFonts w:ascii="Times New Roman" w:hAnsi="Times New Roman" w:cs="Times New Roman"/>
+          <w:color w:val="000000" w:themeColor="text1"/>
+          <w:sz w:val="16"/>
+          <w:szCs w:val="16"/>
+        </w:rPr>
+      </w:pPr>
     </w:p>
     <w:p>
       <w:pPr>
@@ -2977,7 +2896,7 @@
       </w:r>
     </w:p>
     <w:sectPr>
-      <w:footerReference w:type="default" r:id="rId13"/>
+      <w:footerReference w:type="default" r:id="rId14"/>
       <w:type w:val="continuous"/>
       <w:pgSz w:w="12240" w:h="15840"/>
       <w:pgMar w:top="720" w:right="720" w:bottom="720" w:left="720" w:header="432" w:footer="720" w:gutter="0"/>

</xml_diff>